<commit_message>
docs(prd): integrate block diagrams, simplify PRD for review, and follow template
</commit_message>
<xml_diff>
--- a/smart_programmable_power_supply/PRD.docx
+++ b/smart_programmable_power_supply/PRD.docx
@@ -6262,103 +6262,45 @@
         <w:t>List of Figures</w:t>
       </w:r>
     </w:p>
-    <w:tbl>
-      <w:tblPr>
-        <w:tblW w:type="dxa" w:w="9316"/>
-        <w:tblLayout w:type="fixed"/>
-        <w:tblLook w:firstColumn="1" w:firstRow="1" w:lastColumn="0" w:lastRow="0" w:noHBand="0" w:noVBand="1" w:val="04A0"/>
-        <w:tblBorders>
-          <w:top w:val="single" w:sz="6" w:space="0" w:color="A0AEC0"/>
-          <w:left w:val="single" w:sz="6" w:space="0" w:color="A0AEC0"/>
-          <w:bottom w:val="single" w:sz="6" w:space="0" w:color="A0AEC0"/>
-          <w:right w:val="single" w:sz="6" w:space="0" w:color="A0AEC0"/>
-          <w:insideH w:val="single" w:sz="6" w:space="0" w:color="A0AEC0"/>
-          <w:insideV w:val="single" w:sz="6" w:space="0" w:color="A0AEC0"/>
-        </w:tblBorders>
-      </w:tblPr>
-      <w:tblGrid>
-        <w:gridCol w:w="9316"/>
-      </w:tblGrid>
-      <w:tr>
-        <w:trPr>
-          <w:cantSplit/>
-          <w:tblHeader/>
-        </w:trPr>
-        <w:tc>
-          <w:tcPr>
-            <w:tcW w:type="dxa" w:w="9316"/>
-            <w:shd w:val="clear" w:color="auto" w:fill="F4F6F9"/>
-            <w:tcMar>
-              <w:top w:w="140" w:type="dxa"/>
-              <w:bottom w:w="140" w:type="dxa"/>
-              <w:left w:w="180" w:type="dxa"/>
-              <w:right w:w="180" w:type="dxa"/>
-            </w:tcMar>
-          </w:tcPr>
-          <w:p>
-            <w:pPr>
-              <w:spacing w:before="40" w:after="40" w:line="252" w:lineRule="auto"/>
-            </w:pPr>
-            <w:r>
-              <w:rPr>
-                <w:rFonts w:ascii="Consolas" w:hAnsi="Consolas"/>
-                <w:color w:val="141923"/>
-                <w:sz w:val="16"/>
-              </w:rPr>
-              <w:t>+--------------------------------------------------------------------------------------------------+</w:t>
-              <w:br/>
-              <w:t>|                                 SPPS MODULE BOUNDARY (SYSTEM 1)                                  |</w:t>
-              <w:br/>
-              <w:t>|                                                                                                  |</w:t>
-              <w:br/>
-              <w:t>|  [AC Mains 85-265V] ---&gt; [2-Stage EMI Filter] ---&gt; [Bridge Rectifier] ---&gt; [Primary DC Bus ~325V] |</w:t>
-              <w:br/>
-              <w:t>|                                                                                |                 |</w:t>
-              <w:br/>
-              <w:t>|                                                                                v                 |</w:t>
-              <w:br/>
-              <w:t>|                                                                 [UCC28740 Quasi-Resonant Flyback] |</w:t>
-              <w:br/>
-              <w:t>|                                                                                |                 |</w:t>
-              <w:br/>
-              <w:t>|                                                                    (Reinforced Galvanic Isolation)|</w:t>
-              <w:br/>
-              <w:t>|                                                                                |                 |</w:t>
-              <w:br/>
-              <w:t>|                                                                                v                 |</w:t>
-              <w:br/>
-              <w:t>|                                                                 [Secondary +24.0V DC Rail (72W)] |</w:t>
-              <w:br/>
-              <w:t>|                                                                                |                 |</w:t>
-              <w:br/>
-              <w:t>|                                                                                v                 |</w:t>
-              <w:br/>
-              <w:t>|                                                                 [LM5176 4-Switch Sync Buck-Boost] |</w:t>
-              <w:br/>
-              <w:t>|                                                                                |                 |</w:t>
-              <w:br/>
-              <w:t>|                                                                                v                 |</w:t>
-              <w:br/>
-              <w:t>|  [DUT / Load] &lt;--- [4mm Gold Binding Posts] &lt;--- [10mΩ Shunt] &lt;--- [Dual LC Filter (sub-25mV)]   |</w:t>
-              <w:br/>
-              <w:t>|                                                      |                         |                 |</w:t>
-              <w:br/>
-              <w:t>|                                                      v                         v                 |</w:t>
-              <w:br/>
-              <w:t>|  [Host PC / ATE] &lt;=== [USB-C SCPI] &lt;=== [STM32G474 MCU Core] &lt;--- [12-Bit DAC Summing Injection]|</w:t>
-              <w:br/>
-              <w:t>|                                                 |                                                |</w:t>
-              <w:br/>
-              <w:t>|                                                 v                                                |</w:t>
-              <w:br/>
-              <w:t>|                                     [1.3" OLED Display &amp; Dual Encoders]                          |</w:t>
-              <w:br/>
-              <w:t>+--------------------------------------------------------------------------------------------------+</w:t>
-            </w:r>
-          </w:p>
-        </w:tc>
-      </w:tr>
-    </w:tbl>
+    <w:p>
+      <w:pPr>
+        <w:jc w:val="center"/>
+      </w:pPr>
+      <w:r>
+        <w:drawing>
+          <wp:inline xmlns:a="http://schemas.openxmlformats.org/drawingml/2006/main" xmlns:pic="http://schemas.openxmlformats.org/drawingml/2006/picture">
+            <wp:extent cx="5916168" cy="1977760"/>
+            <wp:docPr id="22" name="Picture 22"/>
+            <wp:cNvGraphicFramePr>
+              <a:graphicFrameLocks noChangeAspect="1"/>
+            </wp:cNvGraphicFramePr>
+            <a:graphic>
+              <a:graphicData uri="http://schemas.openxmlformats.org/drawingml/2006/picture">
+                <pic:pic>
+                  <pic:nvPicPr>
+                    <pic:cNvPr id="0" name="smart_programmable_power_supply_system_block_diagram.png"/>
+                    <pic:cNvPicPr/>
+                  </pic:nvPicPr>
+                  <pic:blipFill>
+                    <a:blip r:embed="rId17"/>
+                    <a:stretch>
+                      <a:fillRect/>
+                    </a:stretch>
+                  </pic:blipFill>
+                  <pic:spPr>
+                    <a:xfrm>
+                      <a:off x="0" y="0"/>
+                      <a:ext cx="5916168" cy="1977760"/>
+                    </a:xfrm>
+                    <a:prstGeom prst="rect"/>
+                  </pic:spPr>
+                </pic:pic>
+              </a:graphicData>
+            </a:graphic>
+          </wp:inline>
+        </w:drawing>
+      </w:r>
+    </w:p>
     <w:p>
       <w:pPr>
         <w:pStyle w:val="TableofFigures"/>
@@ -6373,7 +6315,7 @@
         </w:rPr>
       </w:pPr>
       <w:r>
-        <w:t>Figure 1: System Boundary &amp; Interconnect Block Diagram</w:t>
+        <w:t>Figure 1: System Boundary &amp; Master Architecture Block Diagram</w:t>
       </w:r>
     </w:p>
     <w:p>
@@ -9730,7 +9672,7 @@
         </w:rPr>
       </w:pPr>
       <w:r>
-        <w:t>The benchtop operational voltage tuning sequence is illustrated in Figure 2 below:</w:t>
+        <w:t>The benchtop operational voltage tuning sequence is summarized in Figure 2 below:</w:t>
       </w:r>
     </w:p>
     <w:tbl>
@@ -9739,16 +9681,18 @@
         <w:tblLayout w:type="fixed"/>
         <w:tblLook w:firstColumn="1" w:firstRow="1" w:lastColumn="0" w:lastRow="0" w:noHBand="0" w:noVBand="1" w:val="04A0"/>
         <w:tblBorders>
-          <w:top w:val="single" w:sz="6" w:space="0" w:color="A0AEC0"/>
-          <w:left w:val="single" w:sz="6" w:space="0" w:color="A0AEC0"/>
-          <w:bottom w:val="single" w:sz="6" w:space="0" w:color="A0AEC0"/>
-          <w:right w:val="single" w:sz="6" w:space="0" w:color="A0AEC0"/>
-          <w:insideH w:val="single" w:sz="6" w:space="0" w:color="A0AEC0"/>
-          <w:insideV w:val="single" w:sz="6" w:space="0" w:color="A0AEC0"/>
+          <w:top w:val="single" w:sz="4" w:space="0" w:color="CBD5E0"/>
+          <w:left w:val="single" w:sz="4" w:space="0" w:color="CBD5E0"/>
+          <w:bottom w:val="single" w:sz="4" w:space="0" w:color="CBD5E0"/>
+          <w:right w:val="single" w:sz="4" w:space="0" w:color="CBD5E0"/>
+          <w:insideH w:val="single" w:sz="4" w:space="0" w:color="CBD5E0"/>
+          <w:insideV w:val="single" w:sz="4" w:space="0" w:color="CBD5E0"/>
         </w:tblBorders>
       </w:tblPr>
       <w:tblGrid>
-        <w:gridCol w:w="9316"/>
+        <w:gridCol w:w="1296"/>
+        <w:gridCol w:w="2592"/>
+        <w:gridCol w:w="5428"/>
       </w:tblGrid>
       <w:tr>
         <w:trPr>
@@ -9758,45 +9702,384 @@
         <w:tc>
           <w:tcPr>
             <w:tcW w:type="dxa" w:w="9316"/>
-            <w:shd w:val="clear" w:color="auto" w:fill="F4F6F9"/>
-            <w:tcMar>
-              <w:top w:w="140" w:type="dxa"/>
-              <w:bottom w:w="140" w:type="dxa"/>
-              <w:left w:w="180" w:type="dxa"/>
-              <w:right w:w="180" w:type="dxa"/>
-            </w:tcMar>
-          </w:tcPr>
-          <w:p>
-            <w:pPr>
-              <w:spacing w:before="40" w:after="40" w:line="252" w:lineRule="auto"/>
-            </w:pPr>
-            <w:r>
-              <w:rPr>
-                <w:rFonts w:ascii="Consolas" w:hAnsi="Consolas"/>
-                <w:color w:val="141923"/>
-                <w:sz w:val="16"/>
-              </w:rPr>
-              <w:t>+--------------------------------------------------------------------------------------------------+</w:t>
-              <w:br/>
-              <w:t>| MAJOR USE CASE 1: PRECISION BENCHTOP VOLTAGE TUNING &amp; TRANSIENT REGULATION                      |</w:t>
-              <w:br/>
-              <w:t>+--------------------------------------------------------------------------------------------------+</w:t>
-              <w:br/>
-              <w:t xml:space="preserve">  [Operator Turn Knob] ---&gt; [Quadrature Pulse EXTI] ---&gt; [STM32 Updates 12-Bit DAC Setpoint]       </w:t>
-              <w:br/>
-              <w:t xml:space="preserve">                                                                     |                             </w:t>
-              <w:br/>
-              <w:t xml:space="preserve">                                                                     v                             </w:t>
-              <w:br/>
-              <w:t xml:space="preserve">  [Vout Settles &lt; 100µs] &lt;--- [LM5176 Shifts PWM Duty] &lt;--- [DAC Injects Current to FB Node]       </w:t>
-              <w:br/>
-              <w:t xml:space="preserve">            |                                                                                      </w:t>
-              <w:br/>
-              <w:t xml:space="preserve">            v                                                                                      </w:t>
-              <w:br/>
-              <w:t xml:space="preserve">  [INA226 Samples New V/I] ---&gt; [STM32 Computes Power &amp; η] ---&gt; [Updates 1.3" OLED Display @ 10fps]</w:t>
-              <w:br/>
-              <w:t>+--------------------------------------------------------------------------------------------------+</w:t>
+            <w:gridSpan w:val="3"/>
+            <w:shd w:val="clear" w:color="auto" w:fill="1A365D"/>
+            <w:vAlign w:val="center"/>
+          </w:tcPr>
+          <w:p>
+            <w:pPr>
+              <w:spacing w:before="40" w:after="40" w:line="252" w:lineRule="auto"/>
+              <w:jc w:val="left"/>
+            </w:pPr>
+            <w:r/>
+            <w:r>
+              <w:rPr>
+                <w:rFonts w:ascii="Arial" w:hAnsi="Arial"/>
+                <w:b/>
+                <w:color w:val="FFFFFF"/>
+                <w:sz w:val="18"/>
+              </w:rPr>
+              <w:t>MAJOR USE CASE 1: VOLTAGE SETPOINT TUNING SEQUENCE</w:t>
+            </w:r>
+          </w:p>
+        </w:tc>
+      </w:tr>
+      <w:tr>
+        <w:trPr>
+          <w:cantSplit/>
+        </w:trPr>
+        <w:tc>
+          <w:tcPr>
+            <w:tcW w:type="dxa" w:w="1296"/>
+            <w:shd w:val="clear" w:color="auto" w:fill="EDF2F7"/>
+            <w:vAlign w:val="center"/>
+          </w:tcPr>
+          <w:p>
+            <w:pPr>
+              <w:spacing w:before="40" w:after="40" w:line="252" w:lineRule="auto"/>
+              <w:jc w:val="center"/>
+            </w:pPr>
+            <w:r/>
+            <w:r>
+              <w:rPr>
+                <w:rFonts w:ascii="Arial" w:hAnsi="Arial"/>
+                <w:b/>
+                <w:color w:val="000000"/>
+                <w:sz w:val="17"/>
+              </w:rPr>
+              <w:t>Step 1</w:t>
+            </w:r>
+          </w:p>
+        </w:tc>
+        <w:tc>
+          <w:tcPr>
+            <w:tcW w:type="dxa" w:w="2592"/>
+            <w:vAlign w:val="center"/>
+          </w:tcPr>
+          <w:p>
+            <w:pPr>
+              <w:spacing w:before="40" w:after="40" w:line="252" w:lineRule="auto"/>
+              <w:jc w:val="left"/>
+            </w:pPr>
+            <w:r/>
+            <w:r>
+              <w:rPr>
+                <w:rFonts w:ascii="Arial" w:hAnsi="Arial"/>
+                <w:b/>
+                <w:color w:val="000000"/>
+                <w:sz w:val="17"/>
+              </w:rPr>
+              <w:t>Operator / Host PC</w:t>
+            </w:r>
+          </w:p>
+        </w:tc>
+        <w:tc>
+          <w:tcPr>
+            <w:tcW w:type="dxa" w:w="5428"/>
+            <w:vAlign w:val="center"/>
+          </w:tcPr>
+          <w:p>
+            <w:pPr>
+              <w:spacing w:before="40" w:after="40" w:line="252" w:lineRule="auto"/>
+              <w:jc w:val="left"/>
+            </w:pPr>
+            <w:r/>
+            <w:r>
+              <w:rPr>
+                <w:rFonts w:ascii="Arial" w:hAnsi="Arial"/>
+                <w:b w:val="0"/>
+                <w:color w:val="000000"/>
+                <w:sz w:val="17"/>
+              </w:rPr>
+              <w:t>Adjusts front rotary optical encoder knob or transmits SCPI command ':VOLT 12.0' over USB-C interface.</w:t>
+            </w:r>
+          </w:p>
+        </w:tc>
+      </w:tr>
+      <w:tr>
+        <w:trPr>
+          <w:cantSplit/>
+        </w:trPr>
+        <w:tc>
+          <w:tcPr>
+            <w:tcW w:type="dxa" w:w="1296"/>
+            <w:shd w:val="clear" w:color="auto" w:fill="EDF2F7"/>
+            <w:vAlign w:val="center"/>
+          </w:tcPr>
+          <w:p>
+            <w:pPr>
+              <w:spacing w:before="40" w:after="40" w:line="252" w:lineRule="auto"/>
+              <w:jc w:val="center"/>
+            </w:pPr>
+            <w:r/>
+            <w:r>
+              <w:rPr>
+                <w:rFonts w:ascii="Arial" w:hAnsi="Arial"/>
+                <w:b/>
+                <w:color w:val="000000"/>
+                <w:sz w:val="17"/>
+              </w:rPr>
+              <w:t>Step 2</w:t>
+            </w:r>
+          </w:p>
+        </w:tc>
+        <w:tc>
+          <w:tcPr>
+            <w:tcW w:type="dxa" w:w="2592"/>
+            <w:vAlign w:val="center"/>
+          </w:tcPr>
+          <w:p>
+            <w:pPr>
+              <w:spacing w:before="40" w:after="40" w:line="252" w:lineRule="auto"/>
+              <w:jc w:val="left"/>
+            </w:pPr>
+            <w:r/>
+            <w:r>
+              <w:rPr>
+                <w:rFonts w:ascii="Arial" w:hAnsi="Arial"/>
+                <w:b/>
+                <w:color w:val="000000"/>
+                <w:sz w:val="17"/>
+              </w:rPr>
+              <w:t>STM32G474 MCU Core</w:t>
+            </w:r>
+          </w:p>
+        </w:tc>
+        <w:tc>
+          <w:tcPr>
+            <w:tcW w:type="dxa" w:w="5428"/>
+            <w:vAlign w:val="center"/>
+          </w:tcPr>
+          <w:p>
+            <w:pPr>
+              <w:spacing w:before="40" w:after="40" w:line="252" w:lineRule="auto"/>
+              <w:jc w:val="left"/>
+            </w:pPr>
+            <w:r/>
+            <w:r>
+              <w:rPr>
+                <w:rFonts w:ascii="Arial" w:hAnsi="Arial"/>
+                <w:b w:val="0"/>
+                <w:color w:val="000000"/>
+                <w:sz w:val="17"/>
+              </w:rPr>
+              <w:t>Decodes setpoint in &lt; 2ms, calculates DAC voltage, and programs internal 12-Bit DAC1 to 1.76 V.</w:t>
+            </w:r>
+          </w:p>
+        </w:tc>
+      </w:tr>
+      <w:tr>
+        <w:trPr>
+          <w:cantSplit/>
+        </w:trPr>
+        <w:tc>
+          <w:tcPr>
+            <w:tcW w:type="dxa" w:w="1296"/>
+            <w:shd w:val="clear" w:color="auto" w:fill="EDF2F7"/>
+            <w:vAlign w:val="center"/>
+          </w:tcPr>
+          <w:p>
+            <w:pPr>
+              <w:spacing w:before="40" w:after="40" w:line="252" w:lineRule="auto"/>
+              <w:jc w:val="center"/>
+            </w:pPr>
+            <w:r/>
+            <w:r>
+              <w:rPr>
+                <w:rFonts w:ascii="Arial" w:hAnsi="Arial"/>
+                <w:b/>
+                <w:color w:val="000000"/>
+                <w:sz w:val="17"/>
+              </w:rPr>
+              <w:t>Step 3</w:t>
+            </w:r>
+          </w:p>
+        </w:tc>
+        <w:tc>
+          <w:tcPr>
+            <w:tcW w:type="dxa" w:w="2592"/>
+            <w:vAlign w:val="center"/>
+          </w:tcPr>
+          <w:p>
+            <w:pPr>
+              <w:spacing w:before="40" w:after="40" w:line="252" w:lineRule="auto"/>
+              <w:jc w:val="left"/>
+            </w:pPr>
+            <w:r/>
+            <w:r>
+              <w:rPr>
+                <w:rFonts w:ascii="Arial" w:hAnsi="Arial"/>
+                <w:b/>
+                <w:color w:val="000000"/>
+                <w:sz w:val="17"/>
+              </w:rPr>
+              <w:t>Feedback Summing Network</w:t>
+            </w:r>
+          </w:p>
+        </w:tc>
+        <w:tc>
+          <w:tcPr>
+            <w:tcW w:type="dxa" w:w="5428"/>
+            <w:vAlign w:val="center"/>
+          </w:tcPr>
+          <w:p>
+            <w:pPr>
+              <w:spacing w:before="40" w:after="40" w:line="252" w:lineRule="auto"/>
+              <w:jc w:val="left"/>
+            </w:pPr>
+            <w:r/>
+            <w:r>
+              <w:rPr>
+                <w:rFonts w:ascii="Arial" w:hAnsi="Arial"/>
+                <w:b w:val="0"/>
+                <w:color w:val="000000"/>
+                <w:sz w:val="17"/>
+              </w:rPr>
+              <w:t>DAC injects steering current into LM5176 FB node via precision 0.1% divider (R_top=49.9kΩ, R_DAC=11.0kΩ, R_bot=3.65kΩ).</w:t>
+            </w:r>
+          </w:p>
+        </w:tc>
+      </w:tr>
+      <w:tr>
+        <w:trPr>
+          <w:cantSplit/>
+        </w:trPr>
+        <w:tc>
+          <w:tcPr>
+            <w:tcW w:type="dxa" w:w="1296"/>
+            <w:shd w:val="clear" w:color="auto" w:fill="EDF2F7"/>
+            <w:vAlign w:val="center"/>
+          </w:tcPr>
+          <w:p>
+            <w:pPr>
+              <w:spacing w:before="40" w:after="40" w:line="252" w:lineRule="auto"/>
+              <w:jc w:val="center"/>
+            </w:pPr>
+            <w:r/>
+            <w:r>
+              <w:rPr>
+                <w:rFonts w:ascii="Arial" w:hAnsi="Arial"/>
+                <w:b/>
+                <w:color w:val="000000"/>
+                <w:sz w:val="17"/>
+              </w:rPr>
+              <w:t>Step 4</w:t>
+            </w:r>
+          </w:p>
+        </w:tc>
+        <w:tc>
+          <w:tcPr>
+            <w:tcW w:type="dxa" w:w="2592"/>
+            <w:vAlign w:val="center"/>
+          </w:tcPr>
+          <w:p>
+            <w:pPr>
+              <w:spacing w:before="40" w:after="40" w:line="252" w:lineRule="auto"/>
+              <w:jc w:val="left"/>
+            </w:pPr>
+            <w:r/>
+            <w:r>
+              <w:rPr>
+                <w:rFonts w:ascii="Arial" w:hAnsi="Arial"/>
+                <w:b/>
+                <w:color w:val="000000"/>
+                <w:sz w:val="17"/>
+              </w:rPr>
+              <w:t>LM5176 Buck-Boost Stage</w:t>
+            </w:r>
+          </w:p>
+        </w:tc>
+        <w:tc>
+          <w:tcPr>
+            <w:tcW w:type="dxa" w:w="5428"/>
+            <w:vAlign w:val="center"/>
+          </w:tcPr>
+          <w:p>
+            <w:pPr>
+              <w:spacing w:before="40" w:after="40" w:line="252" w:lineRule="auto"/>
+              <w:jc w:val="left"/>
+            </w:pPr>
+            <w:r/>
+            <w:r>
+              <w:rPr>
+                <w:rFonts w:ascii="Arial" w:hAnsi="Arial"/>
+                <w:b w:val="0"/>
+                <w:color w:val="000000"/>
+                <w:sz w:val="17"/>
+              </w:rPr>
+              <w:t>Modulates 4-switch PWM duty cycle; output voltage stabilizes to 12.00 V ± 10 mV in &lt; 100 µs with &lt; 25 mV ripple.</w:t>
+            </w:r>
+          </w:p>
+        </w:tc>
+      </w:tr>
+      <w:tr>
+        <w:trPr>
+          <w:cantSplit/>
+        </w:trPr>
+        <w:tc>
+          <w:tcPr>
+            <w:tcW w:type="dxa" w:w="1296"/>
+            <w:shd w:val="clear" w:color="auto" w:fill="EDF2F7"/>
+            <w:vAlign w:val="center"/>
+          </w:tcPr>
+          <w:p>
+            <w:pPr>
+              <w:spacing w:before="40" w:after="40" w:line="252" w:lineRule="auto"/>
+              <w:jc w:val="center"/>
+            </w:pPr>
+            <w:r/>
+            <w:r>
+              <w:rPr>
+                <w:rFonts w:ascii="Arial" w:hAnsi="Arial"/>
+                <w:b/>
+                <w:color w:val="000000"/>
+                <w:sz w:val="17"/>
+              </w:rPr>
+              <w:t>Step 5</w:t>
+            </w:r>
+          </w:p>
+        </w:tc>
+        <w:tc>
+          <w:tcPr>
+            <w:tcW w:type="dxa" w:w="2592"/>
+            <w:vAlign w:val="center"/>
+          </w:tcPr>
+          <w:p>
+            <w:pPr>
+              <w:spacing w:before="40" w:after="40" w:line="252" w:lineRule="auto"/>
+              <w:jc w:val="left"/>
+            </w:pPr>
+            <w:r/>
+            <w:r>
+              <w:rPr>
+                <w:rFonts w:ascii="Arial" w:hAnsi="Arial"/>
+                <w:b/>
+                <w:color w:val="000000"/>
+                <w:sz w:val="17"/>
+              </w:rPr>
+              <w:t>Dual-Domain Telemetry &amp; UI</w:t>
+            </w:r>
+          </w:p>
+        </w:tc>
+        <w:tc>
+          <w:tcPr>
+            <w:tcW w:type="dxa" w:w="5428"/>
+            <w:vAlign w:val="center"/>
+          </w:tcPr>
+          <w:p>
+            <w:pPr>
+              <w:spacing w:before="40" w:after="40" w:line="252" w:lineRule="auto"/>
+              <w:jc w:val="left"/>
+            </w:pPr>
+            <w:r/>
+            <w:r>
+              <w:rPr>
+                <w:rFonts w:ascii="Arial" w:hAnsi="Arial"/>
+                <w:b w:val="0"/>
+                <w:color w:val="000000"/>
+                <w:sz w:val="17"/>
+              </w:rPr>
+              <w:t>INA226 samples new VOUT/IOUT; MCU updates live 1.3" OLED dashboard and pushes timestamped record to MicroSD card.</w:t>
             </w:r>
           </w:p>
         </w:tc>
@@ -9810,7 +10093,7 @@
         </w:rPr>
       </w:pPr>
       <w:r>
-        <w:t>Figure 2: Major Use Case 1 - Precision Benchtop Supply Voltage Tuning Sequence</w:t>
+        <w:t>Figure 2: Major Use Case 1 - Precision Benchtop Supply Voltage Tuning Workflow</w:t>
       </w:r>
     </w:p>
     <w:p>
@@ -9828,7 +10111,7 @@
         </w:rPr>
       </w:pPr>
       <w:r>
-        <w:t>The automated ATE SCPI instrumentation and telemetry logging flow is illustrated in Figure 3 below:</w:t>
+        <w:t>The automated ATE SCPI instrumentation and telemetry logging flow is summarized in Figure 3 below:</w:t>
       </w:r>
     </w:p>
     <w:tbl>
@@ -9837,16 +10120,18 @@
         <w:tblLayout w:type="fixed"/>
         <w:tblLook w:firstColumn="1" w:firstRow="1" w:lastColumn="0" w:lastRow="0" w:noHBand="0" w:noVBand="1" w:val="04A0"/>
         <w:tblBorders>
-          <w:top w:val="single" w:sz="6" w:space="0" w:color="A0AEC0"/>
-          <w:left w:val="single" w:sz="6" w:space="0" w:color="A0AEC0"/>
-          <w:bottom w:val="single" w:sz="6" w:space="0" w:color="A0AEC0"/>
-          <w:right w:val="single" w:sz="6" w:space="0" w:color="A0AEC0"/>
-          <w:insideH w:val="single" w:sz="6" w:space="0" w:color="A0AEC0"/>
-          <w:insideV w:val="single" w:sz="6" w:space="0" w:color="A0AEC0"/>
+          <w:top w:val="single" w:sz="4" w:space="0" w:color="CBD5E0"/>
+          <w:left w:val="single" w:sz="4" w:space="0" w:color="CBD5E0"/>
+          <w:bottom w:val="single" w:sz="4" w:space="0" w:color="CBD5E0"/>
+          <w:right w:val="single" w:sz="4" w:space="0" w:color="CBD5E0"/>
+          <w:insideH w:val="single" w:sz="4" w:space="0" w:color="CBD5E0"/>
+          <w:insideV w:val="single" w:sz="4" w:space="0" w:color="CBD5E0"/>
         </w:tblBorders>
       </w:tblPr>
       <w:tblGrid>
-        <w:gridCol w:w="9316"/>
+        <w:gridCol w:w="1296"/>
+        <w:gridCol w:w="2592"/>
+        <w:gridCol w:w="5428"/>
       </w:tblGrid>
       <w:tr>
         <w:trPr>
@@ -9856,59 +10141,384 @@
         <w:tc>
           <w:tcPr>
             <w:tcW w:type="dxa" w:w="9316"/>
-            <w:shd w:val="clear" w:color="auto" w:fill="F4F6F9"/>
-            <w:tcMar>
-              <w:top w:w="140" w:type="dxa"/>
-              <w:bottom w:w="140" w:type="dxa"/>
-              <w:left w:w="180" w:type="dxa"/>
-              <w:right w:w="180" w:type="dxa"/>
-            </w:tcMar>
-          </w:tcPr>
-          <w:p>
-            <w:pPr>
-              <w:spacing w:before="40" w:after="40" w:line="252" w:lineRule="auto"/>
-            </w:pPr>
-            <w:r>
-              <w:rPr>
-                <w:rFonts w:ascii="Consolas" w:hAnsi="Consolas"/>
-                <w:color w:val="141923"/>
-                <w:sz w:val="16"/>
-              </w:rPr>
-              <w:t>+--------------------------------------------------------------------------------------------------+</w:t>
-              <w:br/>
-              <w:t>| MAJOR USE CASE 2: AUTOMATED ATE INSTRUMENTATION CONTROL &amp; DATA LOGGING FLOW                     |</w:t>
-              <w:br/>
-              <w:t>+--------------------------------------------------------------------------------------------------+</w:t>
-              <w:br/>
-              <w:t xml:space="preserve">  [Host PC / Automated ATE]                                                                        </w:t>
-              <w:br/>
-              <w:t xml:space="preserve">            |                                                                                      </w:t>
-              <w:br/>
-              <w:t xml:space="preserve">            |--- (1) USB-CDC SCPI Command: ":VOLT 12.000;:CURR 2.500;:OUTP ON" ----------------&gt;   </w:t>
-              <w:br/>
-              <w:t xml:space="preserve">            |                                            |                                         </w:t>
-              <w:br/>
-              <w:t xml:space="preserve">            |                                            v                                         </w:t>
-              <w:br/>
-              <w:t xml:space="preserve">            |                                 [STM32 SCPI Parser Task]                             </w:t>
-              <w:br/>
-              <w:t xml:space="preserve">            |                                            |                                         </w:t>
-              <w:br/>
-              <w:t xml:space="preserve">            |                                            v                                         </w:t>
-              <w:br/>
-              <w:t xml:space="preserve">            |                                 [Configures DAC &amp; Clamps]                            </w:t>
-              <w:br/>
-              <w:t xml:space="preserve">            |                                            |                                         </w:t>
-              <w:br/>
-              <w:t xml:space="preserve">            |&lt;-- (2) SCPI Query Response: ":MEAS:EFF?" -&gt; "93.45%" ---------------------------|   </w:t>
-              <w:br/>
-              <w:t xml:space="preserve">            |                                            |                                         </w:t>
-              <w:br/>
-              <w:t xml:space="preserve">            v                                            v                                         </w:t>
-              <w:br/>
-              <w:t xml:space="preserve">  [Host CSV Database]                         [MicroSD Card: Writes FAT32 Records @ 10Hz Rate]     </w:t>
-              <w:br/>
-              <w:t>+--------------------------------------------------------------------------------------------------+</w:t>
+            <w:gridSpan w:val="3"/>
+            <w:shd w:val="clear" w:color="auto" w:fill="234E52"/>
+            <w:vAlign w:val="center"/>
+          </w:tcPr>
+          <w:p>
+            <w:pPr>
+              <w:spacing w:before="40" w:after="40" w:line="252" w:lineRule="auto"/>
+              <w:jc w:val="left"/>
+            </w:pPr>
+            <w:r/>
+            <w:r>
+              <w:rPr>
+                <w:rFonts w:ascii="Arial" w:hAnsi="Arial"/>
+                <w:b/>
+                <w:color w:val="FFFFFF"/>
+                <w:sz w:val="18"/>
+              </w:rPr>
+              <w:t>MAJOR USE CASE 2: AUTOMATED ATE SCPI &amp; TELEMETRY FLOW</w:t>
+            </w:r>
+          </w:p>
+        </w:tc>
+      </w:tr>
+      <w:tr>
+        <w:trPr>
+          <w:cantSplit/>
+        </w:trPr>
+        <w:tc>
+          <w:tcPr>
+            <w:tcW w:type="dxa" w:w="1296"/>
+            <w:shd w:val="clear" w:color="auto" w:fill="EDF2F7"/>
+            <w:vAlign w:val="center"/>
+          </w:tcPr>
+          <w:p>
+            <w:pPr>
+              <w:spacing w:before="40" w:after="40" w:line="252" w:lineRule="auto"/>
+              <w:jc w:val="center"/>
+            </w:pPr>
+            <w:r/>
+            <w:r>
+              <w:rPr>
+                <w:rFonts w:ascii="Arial" w:hAnsi="Arial"/>
+                <w:b/>
+                <w:color w:val="000000"/>
+                <w:sz w:val="17"/>
+              </w:rPr>
+              <w:t>Step 1</w:t>
+            </w:r>
+          </w:p>
+        </w:tc>
+        <w:tc>
+          <w:tcPr>
+            <w:tcW w:type="dxa" w:w="2592"/>
+            <w:vAlign w:val="center"/>
+          </w:tcPr>
+          <w:p>
+            <w:pPr>
+              <w:spacing w:before="40" w:after="40" w:line="252" w:lineRule="auto"/>
+              <w:jc w:val="left"/>
+            </w:pPr>
+            <w:r/>
+            <w:r>
+              <w:rPr>
+                <w:rFonts w:ascii="Arial" w:hAnsi="Arial"/>
+                <w:b/>
+                <w:color w:val="000000"/>
+                <w:sz w:val="17"/>
+              </w:rPr>
+              <w:t>Automated ATE / Host PC</w:t>
+            </w:r>
+          </w:p>
+        </w:tc>
+        <w:tc>
+          <w:tcPr>
+            <w:tcW w:type="dxa" w:w="5428"/>
+            <w:vAlign w:val="center"/>
+          </w:tcPr>
+          <w:p>
+            <w:pPr>
+              <w:spacing w:before="40" w:after="40" w:line="252" w:lineRule="auto"/>
+              <w:jc w:val="left"/>
+            </w:pPr>
+            <w:r/>
+            <w:r>
+              <w:rPr>
+                <w:rFonts w:ascii="Arial" w:hAnsi="Arial"/>
+                <w:b w:val="0"/>
+                <w:color w:val="000000"/>
+                <w:sz w:val="17"/>
+              </w:rPr>
+              <w:t>Sends standard SCPI batch command over USB-CDC: ':VOLT 15.000;:CURR 2.000;:OUTP ON' at 115200 baud.</w:t>
+            </w:r>
+          </w:p>
+        </w:tc>
+      </w:tr>
+      <w:tr>
+        <w:trPr>
+          <w:cantSplit/>
+        </w:trPr>
+        <w:tc>
+          <w:tcPr>
+            <w:tcW w:type="dxa" w:w="1296"/>
+            <w:shd w:val="clear" w:color="auto" w:fill="EDF2F7"/>
+            <w:vAlign w:val="center"/>
+          </w:tcPr>
+          <w:p>
+            <w:pPr>
+              <w:spacing w:before="40" w:after="40" w:line="252" w:lineRule="auto"/>
+              <w:jc w:val="center"/>
+            </w:pPr>
+            <w:r/>
+            <w:r>
+              <w:rPr>
+                <w:rFonts w:ascii="Arial" w:hAnsi="Arial"/>
+                <w:b/>
+                <w:color w:val="000000"/>
+                <w:sz w:val="17"/>
+              </w:rPr>
+              <w:t>Step 2</w:t>
+            </w:r>
+          </w:p>
+        </w:tc>
+        <w:tc>
+          <w:tcPr>
+            <w:tcW w:type="dxa" w:w="2592"/>
+            <w:vAlign w:val="center"/>
+          </w:tcPr>
+          <w:p>
+            <w:pPr>
+              <w:spacing w:before="40" w:after="40" w:line="252" w:lineRule="auto"/>
+              <w:jc w:val="left"/>
+            </w:pPr>
+            <w:r/>
+            <w:r>
+              <w:rPr>
+                <w:rFonts w:ascii="Arial" w:hAnsi="Arial"/>
+                <w:b/>
+                <w:color w:val="000000"/>
+                <w:sz w:val="17"/>
+              </w:rPr>
+              <w:t>SCPI Parser Task</w:t>
+            </w:r>
+          </w:p>
+        </w:tc>
+        <w:tc>
+          <w:tcPr>
+            <w:tcW w:type="dxa" w:w="5428"/>
+            <w:vAlign w:val="center"/>
+          </w:tcPr>
+          <w:p>
+            <w:pPr>
+              <w:spacing w:before="40" w:after="40" w:line="252" w:lineRule="auto"/>
+              <w:jc w:val="left"/>
+            </w:pPr>
+            <w:r/>
+            <w:r>
+              <w:rPr>
+                <w:rFonts w:ascii="Arial" w:hAnsi="Arial"/>
+                <w:b w:val="0"/>
+                <w:color w:val="000000"/>
+                <w:sz w:val="17"/>
+              </w:rPr>
+              <w:t>FreeRTOS task verifies command syntax, adjusts DAC1 (15V) and DAC2 (2A limit), and enables power output.</w:t>
+            </w:r>
+          </w:p>
+        </w:tc>
+      </w:tr>
+      <w:tr>
+        <w:trPr>
+          <w:cantSplit/>
+        </w:trPr>
+        <w:tc>
+          <w:tcPr>
+            <w:tcW w:type="dxa" w:w="1296"/>
+            <w:shd w:val="clear" w:color="auto" w:fill="EDF2F7"/>
+            <w:vAlign w:val="center"/>
+          </w:tcPr>
+          <w:p>
+            <w:pPr>
+              <w:spacing w:before="40" w:after="40" w:line="252" w:lineRule="auto"/>
+              <w:jc w:val="center"/>
+            </w:pPr>
+            <w:r/>
+            <w:r>
+              <w:rPr>
+                <w:rFonts w:ascii="Arial" w:hAnsi="Arial"/>
+                <w:b/>
+                <w:color w:val="000000"/>
+                <w:sz w:val="17"/>
+              </w:rPr>
+              <w:t>Step 3</w:t>
+            </w:r>
+          </w:p>
+        </w:tc>
+        <w:tc>
+          <w:tcPr>
+            <w:tcW w:type="dxa" w:w="2592"/>
+            <w:vAlign w:val="center"/>
+          </w:tcPr>
+          <w:p>
+            <w:pPr>
+              <w:spacing w:before="40" w:after="40" w:line="252" w:lineRule="auto"/>
+              <w:jc w:val="left"/>
+            </w:pPr>
+            <w:r/>
+            <w:r>
+              <w:rPr>
+                <w:rFonts w:ascii="Arial" w:hAnsi="Arial"/>
+                <w:b/>
+                <w:color w:val="000000"/>
+                <w:sz w:val="17"/>
+              </w:rPr>
+              <w:t>Automated ATE / Host PC</w:t>
+            </w:r>
+          </w:p>
+        </w:tc>
+        <w:tc>
+          <w:tcPr>
+            <w:tcW w:type="dxa" w:w="5428"/>
+            <w:vAlign w:val="center"/>
+          </w:tcPr>
+          <w:p>
+            <w:pPr>
+              <w:spacing w:before="40" w:after="40" w:line="252" w:lineRule="auto"/>
+              <w:jc w:val="left"/>
+            </w:pPr>
+            <w:r/>
+            <w:r>
+              <w:rPr>
+                <w:rFonts w:ascii="Arial" w:hAnsi="Arial"/>
+                <w:b w:val="0"/>
+                <w:color w:val="000000"/>
+                <w:sz w:val="17"/>
+              </w:rPr>
+              <w:t>Transmits telemetry query command ':MEAS:EFF?' to audit conversion efficiency during device test.</w:t>
+            </w:r>
+          </w:p>
+        </w:tc>
+      </w:tr>
+      <w:tr>
+        <w:trPr>
+          <w:cantSplit/>
+        </w:trPr>
+        <w:tc>
+          <w:tcPr>
+            <w:tcW w:type="dxa" w:w="1296"/>
+            <w:shd w:val="clear" w:color="auto" w:fill="EDF2F7"/>
+            <w:vAlign w:val="center"/>
+          </w:tcPr>
+          <w:p>
+            <w:pPr>
+              <w:spacing w:before="40" w:after="40" w:line="252" w:lineRule="auto"/>
+              <w:jc w:val="center"/>
+            </w:pPr>
+            <w:r/>
+            <w:r>
+              <w:rPr>
+                <w:rFonts w:ascii="Arial" w:hAnsi="Arial"/>
+                <w:b/>
+                <w:color w:val="000000"/>
+                <w:sz w:val="17"/>
+              </w:rPr>
+              <w:t>Step 4</w:t>
+            </w:r>
+          </w:p>
+        </w:tc>
+        <w:tc>
+          <w:tcPr>
+            <w:tcW w:type="dxa" w:w="2592"/>
+            <w:vAlign w:val="center"/>
+          </w:tcPr>
+          <w:p>
+            <w:pPr>
+              <w:spacing w:before="40" w:after="40" w:line="252" w:lineRule="auto"/>
+              <w:jc w:val="left"/>
+            </w:pPr>
+            <w:r/>
+            <w:r>
+              <w:rPr>
+                <w:rFonts w:ascii="Arial" w:hAnsi="Arial"/>
+                <w:b/>
+                <w:color w:val="000000"/>
+                <w:sz w:val="17"/>
+              </w:rPr>
+              <w:t>Efficiency Math Engine</w:t>
+            </w:r>
+          </w:p>
+        </w:tc>
+        <w:tc>
+          <w:tcPr>
+            <w:tcW w:type="dxa" w:w="5428"/>
+            <w:vAlign w:val="center"/>
+          </w:tcPr>
+          <w:p>
+            <w:pPr>
+              <w:spacing w:before="40" w:after="40" w:line="252" w:lineRule="auto"/>
+              <w:jc w:val="left"/>
+            </w:pPr>
+            <w:r/>
+            <w:r>
+              <w:rPr>
+                <w:rFonts w:ascii="Arial" w:hAnsi="Arial"/>
+                <w:b w:val="0"/>
+                <w:color w:val="000000"/>
+                <w:sz w:val="17"/>
+              </w:rPr>
+              <w:t>Samples AMC1311 AC power (Pac) and INA226 DC power (Pdc), computes η = (Pdc/Pac) × 100%, and replies '91.2%' in &lt; 2ms.</w:t>
+            </w:r>
+          </w:p>
+        </w:tc>
+      </w:tr>
+      <w:tr>
+        <w:trPr>
+          <w:cantSplit/>
+        </w:trPr>
+        <w:tc>
+          <w:tcPr>
+            <w:tcW w:type="dxa" w:w="1296"/>
+            <w:shd w:val="clear" w:color="auto" w:fill="EDF2F7"/>
+            <w:vAlign w:val="center"/>
+          </w:tcPr>
+          <w:p>
+            <w:pPr>
+              <w:spacing w:before="40" w:after="40" w:line="252" w:lineRule="auto"/>
+              <w:jc w:val="center"/>
+            </w:pPr>
+            <w:r/>
+            <w:r>
+              <w:rPr>
+                <w:rFonts w:ascii="Arial" w:hAnsi="Arial"/>
+                <w:b/>
+                <w:color w:val="000000"/>
+                <w:sz w:val="17"/>
+              </w:rPr>
+              <w:t>Step 5</w:t>
+            </w:r>
+          </w:p>
+        </w:tc>
+        <w:tc>
+          <w:tcPr>
+            <w:tcW w:type="dxa" w:w="2592"/>
+            <w:vAlign w:val="center"/>
+          </w:tcPr>
+          <w:p>
+            <w:pPr>
+              <w:spacing w:before="40" w:after="40" w:line="252" w:lineRule="auto"/>
+              <w:jc w:val="left"/>
+            </w:pPr>
+            <w:r/>
+            <w:r>
+              <w:rPr>
+                <w:rFonts w:ascii="Arial" w:hAnsi="Arial"/>
+                <w:b/>
+                <w:color w:val="000000"/>
+                <w:sz w:val="17"/>
+              </w:rPr>
+              <w:t>Data Logger Task</w:t>
+            </w:r>
+          </w:p>
+        </w:tc>
+        <w:tc>
+          <w:tcPr>
+            <w:tcW w:type="dxa" w:w="5428"/>
+            <w:vAlign w:val="center"/>
+          </w:tcPr>
+          <w:p>
+            <w:pPr>
+              <w:spacing w:before="40" w:after="40" w:line="252" w:lineRule="auto"/>
+              <w:jc w:val="left"/>
+            </w:pPr>
+            <w:r/>
+            <w:r>
+              <w:rPr>
+                <w:rFonts w:ascii="Arial" w:hAnsi="Arial"/>
+                <w:b w:val="0"/>
+                <w:color w:val="000000"/>
+                <w:sz w:val="17"/>
+              </w:rPr>
+              <w:t>Autonomous FatFs task records complete measurement telemetry into FAT32 CSV file on physical MicroSD card.</w:t>
             </w:r>
           </w:p>
         </w:tc>
@@ -9922,7 +10532,7 @@
         </w:rPr>
       </w:pPr>
       <w:r>
-        <w:t>Figure 3: Major Use Case 2 - Automated ATE Instrumentation SCPI Control &amp; Telemetry Flow</w:t>
+        <w:t>Figure 3: Major Use Case 2 - Automated ATE Instrumentation SCPI Control &amp; Telemetry Workflow</w:t>
       </w:r>
     </w:p>
     <w:p>
@@ -21195,113 +21805,51 @@
       <w:bookmarkEnd w:id="112"/>
       <w:bookmarkEnd w:id="113"/>
     </w:p>
-    <w:tbl>
-      <w:tblPr>
-        <w:tblW w:type="dxa" w:w="9316"/>
-        <w:tblLayout w:type="fixed"/>
-        <w:tblLook w:firstColumn="1" w:firstRow="1" w:lastColumn="0" w:lastRow="0" w:noHBand="0" w:noVBand="1" w:val="04A0"/>
-        <w:tblBorders>
-          <w:top w:val="single" w:sz="6" w:space="0" w:color="A0AEC0"/>
-          <w:left w:val="single" w:sz="6" w:space="0" w:color="A0AEC0"/>
-          <w:bottom w:val="single" w:sz="6" w:space="0" w:color="A0AEC0"/>
-          <w:right w:val="single" w:sz="6" w:space="0" w:color="A0AEC0"/>
-          <w:insideH w:val="single" w:sz="6" w:space="0" w:color="A0AEC0"/>
-          <w:insideV w:val="single" w:sz="6" w:space="0" w:color="A0AEC0"/>
-        </w:tblBorders>
-      </w:tblPr>
-      <w:tblGrid>
-        <w:gridCol w:w="9316"/>
-      </w:tblGrid>
-      <w:tr>
-        <w:trPr>
-          <w:cantSplit/>
-          <w:tblHeader/>
-        </w:trPr>
-        <w:tc>
-          <w:tcPr>
-            <w:tcW w:type="dxa" w:w="9316"/>
-            <w:shd w:val="clear" w:color="auto" w:fill="F4F6F9"/>
-            <w:tcMar>
-              <w:top w:w="140" w:type="dxa"/>
-              <w:bottom w:w="140" w:type="dxa"/>
-              <w:left w:w="180" w:type="dxa"/>
-              <w:right w:w="180" w:type="dxa"/>
-            </w:tcMar>
-          </w:tcPr>
-          <w:p>
-            <w:pPr>
-              <w:spacing w:before="40" w:after="40" w:line="252" w:lineRule="auto"/>
-            </w:pPr>
-            <w:r>
-              <w:rPr>
-                <w:rFonts w:ascii="Consolas" w:hAnsi="Consolas"/>
-                <w:color w:val="141923"/>
-                <w:sz w:val="16"/>
-              </w:rPr>
-              <w:t>+--------------------------------------------------------------------------------------------------+</w:t>
-              <w:br/>
-              <w:t>| SYSTEM 1: DOMAIN 1 (HARDWARE) ELECTRICAL POWER &amp; SENSING ARCHITECTURE                            |</w:t>
-              <w:br/>
-              <w:t>+--------------------------------------------------------------------------------------------------+</w:t>
-              <w:br/>
-              <w:t xml:space="preserve">  [Mains 85-265V] --&gt; [FUSE + NTC + MOV] --&gt; [2-Stage CMC Filter] --&gt; [GBU606 Bridge Rectifier]    </w:t>
-              <w:br/>
-              <w:t xml:space="preserve">                                                                          |                        </w:t>
-              <w:br/>
-              <w:t xml:space="preserve">                                                                          v                        </w:t>
-              <w:br/>
-              <w:t xml:space="preserve">                                                           [Primary Bulk Cap 100µF/450V]           </w:t>
-              <w:br/>
-              <w:t xml:space="preserve">                                                                          |                        </w:t>
-              <w:br/>
-              <w:t xml:space="preserve">                                                                          v                        </w:t>
-              <w:br/>
-              <w:t xml:space="preserve">                                                           [UCC28740 Flyback + IPB80R290P7 FET]    </w:t>
-              <w:br/>
-              <w:t xml:space="preserve">                                                                          |                        </w:t>
-              <w:br/>
-              <w:t xml:space="preserve">                                                          (PQ26/20 Transformer - 3000V Isolation)  </w:t>
-              <w:br/>
-              <w:t xml:space="preserve">                                                                          |                        </w:t>
-              <w:br/>
-              <w:t xml:space="preserve">                                                                          v                        </w:t>
-              <w:br/>
-              <w:t xml:space="preserve">                                                           [MP6908 + BSC052N06NS Synchronous Rect] </w:t>
-              <w:br/>
-              <w:t xml:space="preserve">                                                                          |                        </w:t>
-              <w:br/>
-              <w:t xml:space="preserve">                                                                          v                        </w:t>
-              <w:br/>
-              <w:t xml:space="preserve">                                                           [Intermediate +24.0V DC Rail (72W)]     </w:t>
-              <w:br/>
-              <w:t xml:space="preserve">                                                                          |                        </w:t>
-              <w:br/>
-              <w:t xml:space="preserve">                                                                          v                        </w:t>
-              <w:br/>
-              <w:t xml:space="preserve">                                                           [LM5176 4-Switch Sync Buck-Boost Stage] </w:t>
-              <w:br/>
-              <w:t xml:space="preserve">                                                                          |                        </w:t>
-              <w:br/>
-              <w:t xml:space="preserve">                                                           [4x BSC034N04LS FETs + 10µH Inductor]   </w:t>
-              <w:br/>
-              <w:t xml:space="preserve">                                                                          |                        </w:t>
-              <w:br/>
-              <w:t xml:space="preserve">                                                                          v                        </w:t>
-              <w:br/>
-              <w:t xml:space="preserve">  [Output 5-20V / 3A] &lt;--- [4mm Binding Posts] &lt;--- [10mΩ Shunt] &lt;--- [Output Dual LC Filter]      </w:t>
-              <w:br/>
-              <w:t>+--------------------------------------------------------------------------------------------------+</w:t>
-            </w:r>
-          </w:p>
-        </w:tc>
-      </w:tr>
-    </w:tbl>
+    <w:p>
+      <w:pPr>
+        <w:jc w:val="center"/>
+      </w:pPr>
+      <w:r>
+        <w:drawing>
+          <wp:inline xmlns:a="http://schemas.openxmlformats.org/drawingml/2006/main" xmlns:pic="http://schemas.openxmlformats.org/drawingml/2006/picture">
+            <wp:extent cx="5916168" cy="1977760"/>
+            <wp:docPr id="23" name="Picture 23"/>
+            <wp:cNvGraphicFramePr>
+              <a:graphicFrameLocks noChangeAspect="1"/>
+            </wp:cNvGraphicFramePr>
+            <a:graphic>
+              <a:graphicData uri="http://schemas.openxmlformats.org/drawingml/2006/picture">
+                <pic:pic>
+                  <pic:nvPicPr>
+                    <pic:cNvPr id="0" name="smart_programmable_power_supply_system_block_diagram.png"/>
+                    <pic:cNvPicPr/>
+                  </pic:nvPicPr>
+                  <pic:blipFill>
+                    <a:blip r:embed="rId17"/>
+                    <a:stretch>
+                      <a:fillRect/>
+                    </a:stretch>
+                  </pic:blipFill>
+                  <pic:spPr>
+                    <a:xfrm>
+                      <a:off x="0" y="0"/>
+                      <a:ext cx="5916168" cy="1977760"/>
+                    </a:xfrm>
+                    <a:prstGeom prst="rect"/>
+                  </pic:spPr>
+                </pic:pic>
+              </a:graphicData>
+            </a:graphic>
+          </wp:inline>
+        </w:drawing>
+      </w:r>
+    </w:p>
     <w:p>
       <w:pPr>
         <w:pStyle w:val="Caption"/>
       </w:pPr>
       <w:r>
-        <w:t>Figure 6: System 1 Domain 1 (Hardware) Power &amp; Control Architecture</w:t>
+        <w:t>Figure 6: System 1 Domain 1 (Hardware) Power &amp; Control Architecture Block Diagram</w:t>
       </w:r>
     </w:p>
     <w:p>

</xml_diff>

<commit_message>
docs(prd): replace ASCII diagrams with SVG/PNG block diagrams and integrate into PRD and Word docs
</commit_message>
<xml_diff>
--- a/smart_programmable_power_supply/PRD.docx
+++ b/smart_programmable_power_supply/PRD.docx
@@ -6264,41 +6264,21 @@
     </w:p>
     <w:p>
       <w:pPr>
-        <w:jc w:val="center"/>
+        <w:pStyle w:val="TableofFigures"/>
+        <w:tabs>
+          <w:tab w:val="right" w:leader="dot" w:pos="8296"/>
+        </w:tabs>
+        <w:rPr>
+          <w:rFonts w:asciiTheme="minorHAnsi" w:eastAsiaTheme="minorEastAsia" w:hAnsiTheme="minorHAnsi" w:cstheme="minorBidi"/>
+          <w:noProof/>
+          <w:sz w:val="22"/>
+          <w:lang w:val="en-IN" w:eastAsia="en-IN"/>
+        </w:rPr>
       </w:pPr>
       <w:r>
-        <w:drawing>
-          <wp:inline xmlns:a="http://schemas.openxmlformats.org/drawingml/2006/main" xmlns:pic="http://schemas.openxmlformats.org/drawingml/2006/picture">
-            <wp:extent cx="5916168" cy="1977760"/>
-            <wp:docPr id="22" name="Picture 22"/>
-            <wp:cNvGraphicFramePr>
-              <a:graphicFrameLocks noChangeAspect="1"/>
-            </wp:cNvGraphicFramePr>
-            <a:graphic>
-              <a:graphicData uri="http://schemas.openxmlformats.org/drawingml/2006/picture">
-                <pic:pic>
-                  <pic:nvPicPr>
-                    <pic:cNvPr id="0" name="smart_programmable_power_supply_system_block_diagram.png"/>
-                    <pic:cNvPicPr/>
-                  </pic:nvPicPr>
-                  <pic:blipFill>
-                    <a:blip r:embed="rId17"/>
-                    <a:stretch>
-                      <a:fillRect/>
-                    </a:stretch>
-                  </pic:blipFill>
-                  <pic:spPr>
-                    <a:xfrm>
-                      <a:off x="0" y="0"/>
-                      <a:ext cx="5916168" cy="1977760"/>
-                    </a:xfrm>
-                    <a:prstGeom prst="rect"/>
-                  </pic:spPr>
-                </pic:pic>
-              </a:graphicData>
-            </a:graphic>
-          </wp:inline>
-        </w:drawing>
+        <w:t>Figure 1: System Boundary &amp; Master Architecture Block Diagram</w:t>
+        <w:tab/>
+        <w:t>9</w:t>
       </w:r>
     </w:p>
     <w:p>
@@ -6315,7 +6295,9 @@
         </w:rPr>
       </w:pPr>
       <w:r>
-        <w:t>Figure 1: System Boundary &amp; Master Architecture Block Diagram</w:t>
+        <w:t>Figure 2: Major Use Case 1 - Precision Voltage Setpoint Tuning Workflow</w:t>
+        <w:tab/>
+        <w:t>10</w:t>
       </w:r>
     </w:p>
     <w:p>
@@ -6331,228 +6313,12 @@
           <w:lang w:val="en-IN" w:eastAsia="en-IN"/>
         </w:rPr>
       </w:pPr>
-      <w:hyperlink w:anchor="_Toc28279214" w:history="1">
-        <w:r>
-          <w:rPr>
-            <w:rStyle w:val="Hyperlink"/>
-            <w:noProof/>
-          </w:rPr>
-          <w:t xml:space="preserve">Figure 2: </w:t>
-        </w:r>
-        <w:r>
-          <w:rPr>
-            <w:rStyle w:val="Hyperlink"/>
-            <w:noProof/>
-            <w:lang w:val="en-IN" w:eastAsia="zh-CN" w:bidi="hi-IN"/>
-          </w:rPr>
-          <w:t>Major Use Case 1</w:t>
-        </w:r>
-        <w:r>
-          <w:rPr>
-            <w:noProof/>
-            <w:webHidden/>
-          </w:rPr>
-          <w:tab/>
-        </w:r>
-        <w:r>
-          <w:rPr>
-            <w:noProof/>
-            <w:webHidden/>
-          </w:rPr>
-          <w:fldChar w:fldCharType="begin"/>
-        </w:r>
-        <w:r>
-          <w:rPr>
-            <w:noProof/>
-            <w:webHidden/>
-          </w:rPr>
-          <w:instrText xml:space="preserve"> PAGEREF _Toc28279214 \h </w:instrText>
-        </w:r>
-        <w:r>
-          <w:rPr>
-            <w:noProof/>
-            <w:webHidden/>
-          </w:rPr>
-        </w:r>
-        <w:r>
-          <w:rPr>
-            <w:noProof/>
-            <w:webHidden/>
-          </w:rPr>
-          <w:fldChar w:fldCharType="separate"/>
-        </w:r>
-        <w:r>
-          <w:rPr>
-            <w:noProof/>
-            <w:webHidden/>
-          </w:rPr>
-          <w:t>10</w:t>
-        </w:r>
-        <w:r>
-          <w:rPr>
-            <w:noProof/>
-            <w:webHidden/>
-          </w:rPr>
-          <w:fldChar w:fldCharType="end"/>
-        </w:r>
-      </w:hyperlink>
+      <w:r>
+        <w:t>Figure 3: Major Use Case 2 - Automated ATE Instrumentation SCPI Control Workflow</w:t>
+        <w:tab/>
+        <w:t>10</w:t>
+      </w:r>
     </w:p>
-    <w:p>
-      <w:pPr>
-        <w:pStyle w:val="TableofFigures"/>
-        <w:tabs>
-          <w:tab w:val="right" w:leader="dot" w:pos="8296"/>
-        </w:tabs>
-        <w:rPr>
-          <w:rFonts w:asciiTheme="minorHAnsi" w:eastAsiaTheme="minorEastAsia" w:hAnsiTheme="minorHAnsi" w:cstheme="minorBidi"/>
-          <w:noProof/>
-          <w:sz w:val="22"/>
-          <w:lang w:val="en-IN" w:eastAsia="en-IN"/>
-        </w:rPr>
-      </w:pPr>
-      <w:hyperlink w:anchor="_Toc28279215" w:history="1">
-        <w:r>
-          <w:rPr>
-            <w:rStyle w:val="Hyperlink"/>
-            <w:noProof/>
-          </w:rPr>
-          <w:t xml:space="preserve">Figure 3: </w:t>
-        </w:r>
-        <w:r>
-          <w:rPr>
-            <w:rStyle w:val="Hyperlink"/>
-            <w:noProof/>
-            <w:lang w:val="en-IN" w:eastAsia="zh-CN" w:bidi="hi-IN"/>
-          </w:rPr>
-          <w:t>Major Use Case 1</w:t>
-        </w:r>
-        <w:r>
-          <w:rPr>
-            <w:noProof/>
-            <w:webHidden/>
-          </w:rPr>
-          <w:tab/>
-        </w:r>
-        <w:r>
-          <w:rPr>
-            <w:noProof/>
-            <w:webHidden/>
-          </w:rPr>
-          <w:fldChar w:fldCharType="begin"/>
-        </w:r>
-        <w:r>
-          <w:rPr>
-            <w:noProof/>
-            <w:webHidden/>
-          </w:rPr>
-          <w:instrText xml:space="preserve"> PAGEREF _Toc28279215 \h </w:instrText>
-        </w:r>
-        <w:r>
-          <w:rPr>
-            <w:noProof/>
-            <w:webHidden/>
-          </w:rPr>
-        </w:r>
-        <w:r>
-          <w:rPr>
-            <w:noProof/>
-            <w:webHidden/>
-          </w:rPr>
-          <w:fldChar w:fldCharType="separate"/>
-        </w:r>
-        <w:r>
-          <w:rPr>
-            <w:noProof/>
-            <w:webHidden/>
-          </w:rPr>
-          <w:t>10</w:t>
-        </w:r>
-        <w:r>
-          <w:rPr>
-            <w:noProof/>
-            <w:webHidden/>
-          </w:rPr>
-          <w:fldChar w:fldCharType="end"/>
-        </w:r>
-      </w:hyperlink>
-    </w:p>
-    <w:tbl>
-      <w:tblPr>
-        <w:tblW w:type="dxa" w:w="9316"/>
-        <w:tblLayout w:type="fixed"/>
-        <w:tblLook w:firstColumn="1" w:firstRow="1" w:lastColumn="0" w:lastRow="0" w:noHBand="0" w:noVBand="1" w:val="04A0"/>
-        <w:tblBorders>
-          <w:top w:val="single" w:sz="6" w:space="0" w:color="A0AEC0"/>
-          <w:left w:val="single" w:sz="6" w:space="0" w:color="A0AEC0"/>
-          <w:bottom w:val="single" w:sz="6" w:space="0" w:color="A0AEC0"/>
-          <w:right w:val="single" w:sz="6" w:space="0" w:color="A0AEC0"/>
-          <w:insideH w:val="single" w:sz="6" w:space="0" w:color="A0AEC0"/>
-          <w:insideV w:val="single" w:sz="6" w:space="0" w:color="A0AEC0"/>
-        </w:tblBorders>
-      </w:tblPr>
-      <w:tblGrid>
-        <w:gridCol w:w="9316"/>
-      </w:tblGrid>
-      <w:tr>
-        <w:trPr>
-          <w:cantSplit/>
-          <w:tblHeader/>
-        </w:trPr>
-        <w:tc>
-          <w:tcPr>
-            <w:tcW w:type="dxa" w:w="9316"/>
-            <w:shd w:val="clear" w:color="auto" w:fill="F4F6F9"/>
-            <w:tcMar>
-              <w:top w:w="140" w:type="dxa"/>
-              <w:bottom w:w="140" w:type="dxa"/>
-              <w:left w:w="180" w:type="dxa"/>
-              <w:right w:w="180" w:type="dxa"/>
-            </w:tcMar>
-          </w:tcPr>
-          <w:p>
-            <w:pPr>
-              <w:spacing w:before="40" w:after="40" w:line="252" w:lineRule="auto"/>
-            </w:pPr>
-            <w:r>
-              <w:rPr>
-                <w:rFonts w:ascii="Consolas" w:hAnsi="Consolas"/>
-                <w:color w:val="141923"/>
-                <w:sz w:val="16"/>
-              </w:rPr>
-              <w:t>+--------------------------------------------------------------------------------------------------+</w:t>
-              <w:br/>
-              <w:t>|                     DUAL-CLOSED-LOOP REAL-TIME CONTROL TOPOLOGY                                  |</w:t>
-              <w:br/>
-              <w:t>+--------------------------------------------------------------------------------------------------+</w:t>
-              <w:br/>
-              <w:t xml:space="preserve">  [OUTER SUPERVISORY DIGITAL LOOP - STM32G474 MCU @ 10 Hz]                                         </w:t>
-              <w:br/>
-              <w:t xml:space="preserve">    • Step 1: Sample Isolated Mains Voltage (AMC1311) &amp; Current (Talema CT) -&gt; Compute True Pac   </w:t>
-              <w:br/>
-              <w:t xml:space="preserve">    • Step 2: Sample Secondary Regulated Rail via I2C (INA226 16-Bit)       -&gt; Compute True Pdc   </w:t>
-              <w:br/>
-              <w:t xml:space="preserve">    • Step 3: Math Engine calculates instantaneous efficiency (η = Pdc / Pac) with digital filter  </w:t>
-              <w:br/>
-              <w:t xml:space="preserve">    • Step 4: Monitor Board Thermal Profile via NTC -&gt; Execute thermal power foldback if T &gt; 85°C  </w:t>
-              <w:br/>
-              <w:t xml:space="preserve">    • Step 5: Service SCPI Commands over USB-CDC &amp; Flush Ring-Buffer CSV records to MicroSD card   </w:t>
-              <w:br/>
-              <w:t xml:space="preserve">                                                                                                   </w:t>
-              <w:br/>
-              <w:t xml:space="preserve">  [INNER ULTRA-FAST ANALOG HARDWARE LOOP - AUTONOMOUS CONTROLLER &amp; COMPARATORS]                    </w:t>
-              <w:br/>
-              <w:t xml:space="preserve">    • Voltage Regulation: LM5176 Type-II Compensation Network restores step transients in &lt; 120µs  </w:t>
-              <w:br/>
-              <w:t xml:space="preserve">    • Hardware CC Limit: Shunt -&gt; INA240A2 (50V/V) -&gt; TLV3501 pulls down COMP pin in &lt; 5.0µs      </w:t>
-              <w:br/>
-              <w:t xml:space="preserve">    • Fast OVP Crowbar: Secondary Comparator clamps COMP to GND in &lt; 2.0µs on output disconnect   </w:t>
-              <w:br/>
-              <w:t>+--------------------------------------------------------------------------------------------------+</w:t>
-            </w:r>
-          </w:p>
-        </w:tc>
-      </w:tr>
-    </w:tbl>
     <w:p>
       <w:pPr>
         <w:pStyle w:val="TableofFigures"/>
@@ -6568,6 +6334,8 @@
       </w:pPr>
       <w:r>
         <w:t>Figure 4: Dual-Closed-Loop Control &amp; Hardware Protection Flow Diagram</w:t>
+        <w:tab/>
+        <w:t>15</w:t>
       </w:r>
     </w:p>
     <w:p>
@@ -9256,6 +9024,45 @@
     </w:p>
     <w:p>
       <w:pPr>
+        <w:jc w:val="center"/>
+      </w:pPr>
+      <w:r>
+        <w:drawing>
+          <wp:inline xmlns:a="http://schemas.openxmlformats.org/drawingml/2006/main" xmlns:pic="http://schemas.openxmlformats.org/drawingml/2006/picture">
+            <wp:extent cx="5916168" cy="1977760"/>
+            <wp:docPr id="24" name="Picture 24"/>
+            <wp:cNvGraphicFramePr>
+              <a:graphicFrameLocks noChangeAspect="1"/>
+            </wp:cNvGraphicFramePr>
+            <a:graphic>
+              <a:graphicData uri="http://schemas.openxmlformats.org/drawingml/2006/picture">
+                <pic:pic>
+                  <pic:nvPicPr>
+                    <pic:cNvPr id="0" name="smart_programmable_power_supply_system_block_diagram.png"/>
+                    <pic:cNvPicPr/>
+                  </pic:nvPicPr>
+                  <pic:blipFill>
+                    <a:blip r:embed="rId19"/>
+                    <a:stretch>
+                      <a:fillRect/>
+                    </a:stretch>
+                  </pic:blipFill>
+                  <pic:spPr>
+                    <a:xfrm>
+                      <a:off x="0" y="0"/>
+                      <a:ext cx="5916168" cy="1977760"/>
+                    </a:xfrm>
+                    <a:prstGeom prst="rect"/>
+                  </pic:spPr>
+                </pic:pic>
+              </a:graphicData>
+            </a:graphic>
+          </wp:inline>
+        </w:drawing>
+      </w:r>
+    </w:p>
+    <w:p>
+      <w:pPr>
         <w:pStyle w:val="Caption"/>
         <w:jc w:val="center"/>
         <w:rPr>
@@ -9263,24 +9070,9 @@
           <w:sz w:val="22"/>
         </w:rPr>
       </w:pPr>
-      <w:bookmarkStart w:id="37" w:name="_l2dbp78arg2w" w:colFirst="0" w:colLast="0"/>
-      <w:bookmarkStart w:id="38" w:name="_5f09pmj9qow8" w:colFirst="0" w:colLast="0"/>
-      <w:bookmarkStart w:id="39" w:name="_Toc28279213"/>
-      <w:bookmarkStart w:id="40" w:name="_Hlk28263348"/>
-      <w:bookmarkEnd w:id="37"/>
-      <w:bookmarkEnd w:id="38"/>
       <w:r>
-        <w:t xml:space="preserve">Figure </w:t>
+        <w:t>Figure 1: System Boundary &amp; Master Architecture Block Diagram</w:t>
       </w:r>
-      <w:fldSimple w:instr=" SEQ Figure \* ARABIC ">
-        <w:r>
-          <w:t>1</w:t>
-        </w:r>
-      </w:fldSimple>
-      <w:r>
-        <w:t>: Boundary Diagram</w:t>
-      </w:r>
-      <w:bookmarkEnd w:id="39"/>
     </w:p>
     <w:bookmarkEnd w:id="40"/>
     <w:p>
@@ -9672,7 +9464,46 @@
         </w:rPr>
       </w:pPr>
       <w:r>
-        <w:t>The benchtop operational voltage tuning sequence is summarized in Figure 2 below:</w:t>
+        <w:t>The benchtop operational voltage tuning sequence is summarized in Figure 2 and Table 3.1 below:</w:t>
+      </w:r>
+    </w:p>
+    <w:p>
+      <w:pPr>
+        <w:jc w:val="center"/>
+      </w:pPr>
+      <w:r>
+        <w:drawing>
+          <wp:inline xmlns:a="http://schemas.openxmlformats.org/drawingml/2006/main" xmlns:pic="http://schemas.openxmlformats.org/drawingml/2006/picture">
+            <wp:extent cx="5916168" cy="1155277"/>
+            <wp:docPr id="22" name="Picture 22"/>
+            <wp:cNvGraphicFramePr>
+              <a:graphicFrameLocks noChangeAspect="1"/>
+            </wp:cNvGraphicFramePr>
+            <a:graphic>
+              <a:graphicData uri="http://schemas.openxmlformats.org/drawingml/2006/picture">
+                <pic:pic>
+                  <pic:nvPicPr>
+                    <pic:cNvPr id="0" name="diagram_use_case_1_voltage_tuning.png"/>
+                    <pic:cNvPicPr/>
+                  </pic:nvPicPr>
+                  <pic:blipFill>
+                    <a:blip r:embed="rId17"/>
+                    <a:stretch>
+                      <a:fillRect/>
+                    </a:stretch>
+                  </pic:blipFill>
+                  <pic:spPr>
+                    <a:xfrm>
+                      <a:off x="0" y="0"/>
+                      <a:ext cx="5916168" cy="1155277"/>
+                    </a:xfrm>
+                    <a:prstGeom prst="rect"/>
+                  </pic:spPr>
+                </pic:pic>
+              </a:graphicData>
+            </a:graphic>
+          </wp:inline>
+        </w:drawing>
       </w:r>
     </w:p>
     <w:tbl>
@@ -10111,7 +9942,46 @@
         </w:rPr>
       </w:pPr>
       <w:r>
-        <w:t>The automated ATE SCPI instrumentation and telemetry logging flow is summarized in Figure 3 below:</w:t>
+        <w:t>The automated ATE SCPI instrumentation and telemetry logging flow is summarized in Figure 3 and Table 3.2 below:</w:t>
+      </w:r>
+    </w:p>
+    <w:p>
+      <w:pPr>
+        <w:jc w:val="center"/>
+      </w:pPr>
+      <w:r>
+        <w:drawing>
+          <wp:inline xmlns:a="http://schemas.openxmlformats.org/drawingml/2006/main" xmlns:pic="http://schemas.openxmlformats.org/drawingml/2006/picture">
+            <wp:extent cx="5916168" cy="1607234"/>
+            <wp:docPr id="23" name="Picture 23"/>
+            <wp:cNvGraphicFramePr>
+              <a:graphicFrameLocks noChangeAspect="1"/>
+            </wp:cNvGraphicFramePr>
+            <a:graphic>
+              <a:graphicData uri="http://schemas.openxmlformats.org/drawingml/2006/picture">
+                <pic:pic>
+                  <pic:nvPicPr>
+                    <pic:cNvPr id="0" name="diagram_use_case_2_ate_automation.png"/>
+                    <pic:cNvPicPr/>
+                  </pic:nvPicPr>
+                  <pic:blipFill>
+                    <a:blip r:embed="rId18"/>
+                    <a:stretch>
+                      <a:fillRect/>
+                    </a:stretch>
+                  </pic:blipFill>
+                  <pic:spPr>
+                    <a:xfrm>
+                      <a:off x="0" y="0"/>
+                      <a:ext cx="5916168" cy="1607234"/>
+                    </a:xfrm>
+                    <a:prstGeom prst="rect"/>
+                  </pic:spPr>
+                </pic:pic>
+              </a:graphicData>
+            </a:graphic>
+          </wp:inline>
+        </w:drawing>
       </w:r>
     </w:p>
     <w:tbl>
@@ -18900,7 +18770,7 @@
         <w:pStyle w:val="Heading4"/>
       </w:pPr>
       <w:r>
-        <w:t>Enclosure Packaging &amp; Creepage Isolation Routing</w:t>
+        <w:t>Dual-Closed-Loop Control &amp; Real-Time Protection Flow</w:t>
       </w:r>
     </w:p>
     <w:p>
@@ -18976,6 +18846,45 @@
     </w:p>
     <w:p>
       <w:pPr>
+        <w:jc w:val="center"/>
+      </w:pPr>
+      <w:r>
+        <w:drawing>
+          <wp:inline xmlns:a="http://schemas.openxmlformats.org/drawingml/2006/main" xmlns:pic="http://schemas.openxmlformats.org/drawingml/2006/picture">
+            <wp:extent cx="5916168" cy="2810072"/>
+            <wp:docPr id="25" name="Picture 25"/>
+            <wp:cNvGraphicFramePr>
+              <a:graphicFrameLocks noChangeAspect="1"/>
+            </wp:cNvGraphicFramePr>
+            <a:graphic>
+              <a:graphicData uri="http://schemas.openxmlformats.org/drawingml/2006/picture">
+                <pic:pic>
+                  <pic:nvPicPr>
+                    <pic:cNvPr id="0" name="diagram_control_protection_flow.png"/>
+                    <pic:cNvPicPr/>
+                  </pic:nvPicPr>
+                  <pic:blipFill>
+                    <a:blip r:embed="rId20"/>
+                    <a:stretch>
+                      <a:fillRect/>
+                    </a:stretch>
+                  </pic:blipFill>
+                  <pic:spPr>
+                    <a:xfrm>
+                      <a:off x="0" y="0"/>
+                      <a:ext cx="5916168" cy="2810072"/>
+                    </a:xfrm>
+                    <a:prstGeom prst="rect"/>
+                  </pic:spPr>
+                </pic:pic>
+              </a:graphicData>
+            </a:graphic>
+          </wp:inline>
+        </w:drawing>
+      </w:r>
+    </w:p>
+    <w:p>
+      <w:pPr>
         <w:pStyle w:val="Caption"/>
         <w:jc w:val="center"/>
         <w:rPr>
@@ -18983,23 +18892,9 @@
           <w:sz w:val="22"/>
         </w:rPr>
       </w:pPr>
-      <w:bookmarkStart w:id="88" w:name="_Toc28279216"/>
-      <w:bookmarkStart w:id="89" w:name="_Toc15414754"/>
       <w:r>
-        <w:t xml:space="preserve">Figure </w:t>
+        <w:t>Figure 4: Dual-Closed-Loop Control &amp; Hardware Protection Flow Diagram</w:t>
       </w:r>
-      <w:fldSimple w:instr=" SEQ Figure \* ARABIC ">
-        <w:r>
-          <w:rPr>
-            <w:noProof/>
-          </w:rPr>
-          <w:t>4</w:t>
-        </w:r>
-      </w:fldSimple>
-      <w:r>
-        <w:t>: Flow Diagram</w:t>
-      </w:r>
-      <w:bookmarkEnd w:id="88"/>
     </w:p>
     <w:p>
       <w:pPr>
@@ -19879,22 +19774,67 @@
     </w:p>
     <w:p>
       <w:r>
-        <w:t>Refer to System 1 specific requirements and System 2 firmware wireframe specifications detailed above.</w:t>
+        <w:t>&lt;</w:t>
+      </w:r>
+      <w:r>
+        <w:t xml:space="preserve">Refer </w:t>
+      </w:r>
+      <w:r>
+        <w:t>a</w:t>
+      </w:r>
+      <w:r>
+        <w:t>bove</w:t>
+      </w:r>
+      <w:r>
+        <w:t xml:space="preserve"> section&gt;</w:t>
       </w:r>
     </w:p>
     <w:p>
       <w:pPr>
         <w:pStyle w:val="Heading4"/>
       </w:pPr>
-      <w:bookmarkStart w:id="92" w:name="_Toc15414756"/>
-      <w:bookmarkStart w:id="93" w:name="_Toc14037441"/>
-      <w:bookmarkStart w:id="94" w:name="_Toc15038633"/>
       <w:r>
-        <w:t>Mobile UI Screens/Wireframes</w:t>
+        <w:t>1.3-inch Local OLED Dashboard Graphical UI Wireframe</w:t>
       </w:r>
-      <w:bookmarkEnd w:id="92"/>
-      <w:bookmarkEnd w:id="93"/>
-      <w:bookmarkEnd w:id="94"/>
+    </w:p>
+    <w:p>
+      <w:pPr>
+        <w:jc w:val="center"/>
+      </w:pPr>
+      <w:r>
+        <w:drawing>
+          <wp:inline xmlns:a="http://schemas.openxmlformats.org/drawingml/2006/main" xmlns:pic="http://schemas.openxmlformats.org/drawingml/2006/picture">
+            <wp:extent cx="5916168" cy="2610156"/>
+            <wp:docPr id="26" name="Picture 26"/>
+            <wp:cNvGraphicFramePr>
+              <a:graphicFrameLocks noChangeAspect="1"/>
+            </wp:cNvGraphicFramePr>
+            <a:graphic>
+              <a:graphicData uri="http://schemas.openxmlformats.org/drawingml/2006/picture">
+                <pic:pic>
+                  <pic:nvPicPr>
+                    <pic:cNvPr id="0" name="diagram_oled_dashboard_wireframe.png"/>
+                    <pic:cNvPicPr/>
+                  </pic:nvPicPr>
+                  <pic:blipFill>
+                    <a:blip r:embed="rId21"/>
+                    <a:stretch>
+                      <a:fillRect/>
+                    </a:stretch>
+                  </pic:blipFill>
+                  <pic:spPr>
+                    <a:xfrm>
+                      <a:off x="0" y="0"/>
+                      <a:ext cx="5916168" cy="2610156"/>
+                    </a:xfrm>
+                    <a:prstGeom prst="rect"/>
+                  </pic:spPr>
+                </pic:pic>
+              </a:graphicData>
+            </a:graphic>
+          </wp:inline>
+        </w:drawing>
+      </w:r>
     </w:p>
     <w:p>
       <w:pPr>
@@ -19909,7 +19849,7 @@
         </w:rPr>
       </w:pPr>
       <w:r>
-        <w:t>Refer to System 1 specific requirements and System 2 firmware wireframe specifications detailed above.</w:t>
+        <w:t>Figure 5: 1.3-inch Local OLED Dashboard Graphical Layout &amp; Wireframe</w:t>
       </w:r>
     </w:p>
     <w:p>
@@ -21813,7 +21753,7 @@
         <w:drawing>
           <wp:inline xmlns:a="http://schemas.openxmlformats.org/drawingml/2006/main" xmlns:pic="http://schemas.openxmlformats.org/drawingml/2006/picture">
             <wp:extent cx="5916168" cy="1977760"/>
-            <wp:docPr id="23" name="Picture 23"/>
+            <wp:docPr id="27" name="Picture 27"/>
             <wp:cNvGraphicFramePr>
               <a:graphicFrameLocks noChangeAspect="1"/>
             </wp:cNvGraphicFramePr>
@@ -21825,7 +21765,7 @@
                     <pic:cNvPicPr/>
                   </pic:nvPicPr>
                   <pic:blipFill>
-                    <a:blip r:embed="rId17"/>
+                    <a:blip r:embed="rId19"/>
                     <a:stretch>
                       <a:fillRect/>
                     </a:stretch>
@@ -21900,79 +21840,51 @@
       <w:bookmarkEnd w:id="114"/>
       <w:bookmarkEnd w:id="115"/>
     </w:p>
-    <w:tbl>
-      <w:tblPr>
-        <w:tblW w:type="dxa" w:w="9316"/>
-        <w:tblLayout w:type="fixed"/>
-        <w:tblLook w:firstColumn="1" w:firstRow="1" w:lastColumn="0" w:lastRow="0" w:noHBand="0" w:noVBand="1" w:val="04A0"/>
-        <w:tblBorders>
-          <w:top w:val="single" w:sz="6" w:space="0" w:color="A0AEC0"/>
-          <w:left w:val="single" w:sz="6" w:space="0" w:color="A0AEC0"/>
-          <w:bottom w:val="single" w:sz="6" w:space="0" w:color="A0AEC0"/>
-          <w:right w:val="single" w:sz="6" w:space="0" w:color="A0AEC0"/>
-          <w:insideH w:val="single" w:sz="6" w:space="0" w:color="A0AEC0"/>
-          <w:insideV w:val="single" w:sz="6" w:space="0" w:color="A0AEC0"/>
-        </w:tblBorders>
-      </w:tblPr>
-      <w:tblGrid>
-        <w:gridCol w:w="9316"/>
-      </w:tblGrid>
-      <w:tr>
-        <w:trPr>
-          <w:cantSplit/>
-          <w:tblHeader/>
-        </w:trPr>
-        <w:tc>
-          <w:tcPr>
-            <w:tcW w:type="dxa" w:w="9316"/>
-            <w:shd w:val="clear" w:color="auto" w:fill="F4F6F9"/>
-            <w:tcMar>
-              <w:top w:w="140" w:type="dxa"/>
-              <w:bottom w:w="140" w:type="dxa"/>
-              <w:left w:w="180" w:type="dxa"/>
-              <w:right w:w="180" w:type="dxa"/>
-            </w:tcMar>
-          </w:tcPr>
-          <w:p>
-            <w:pPr>
-              <w:spacing w:before="40" w:after="40" w:line="252" w:lineRule="auto"/>
-            </w:pPr>
-            <w:r>
-              <w:rPr>
-                <w:rFonts w:ascii="Consolas" w:hAnsi="Consolas"/>
-                <w:color w:val="141923"/>
-                <w:sz w:val="16"/>
-              </w:rPr>
-              <w:t>+--------------------------------------------------------------------------------------------------+</w:t>
-              <w:br/>
-              <w:t>| SYSTEM 1: DOMAIN 2 (MECHANICAL) ENCLOSURE &amp; THERMAL ARCHITECTURE                                 |</w:t>
-              <w:br/>
-              <w:t>+--------------------------------------------------------------------------------------------------+</w:t>
-              <w:br/>
-              <w:t xml:space="preserve">  • Overall Dimensions: 130 mm (Width) x 85 mm (Depth) x 42 mm (Height). Natural Convection Shell. </w:t>
-              <w:br/>
-              <w:t xml:space="preserve">  • Enclosure Material: Extruded Anodized Aluminum 6063-T5 (2.0mm wall) with internal card guides. </w:t>
-              <w:br/>
-              <w:t xml:space="preserve">  • Front Panel: Dual 4mm Gold Binding Posts, Rotary Encoders, Output Push-button, 1.3" OLED Window</w:t>
-              <w:br/>
-              <w:t xml:space="preserve">  • Rear Panel: IEC 320-C14 AC Receptacle with fuse drawer, USB Type-C Receptacle, MicroSD Slot.   </w:t>
-              <w:br/>
-              <w:t xml:space="preserve">  • Thermal Management: Flyback Primary MOSFET &amp; Secondary Sync FET clamped to chassis bottom.     </w:t>
-              <w:br/>
-              <w:t xml:space="preserve">  • Isolation Barrier: Milled 6.4 mm air slot across PCB beneath optocouplers and transformer.    </w:t>
-              <w:br/>
-              <w:t>+--------------------------------------------------------------------------------------------------+</w:t>
-            </w:r>
-          </w:p>
-        </w:tc>
-      </w:tr>
-    </w:tbl>
+    <w:p>
+      <w:pPr>
+        <w:jc w:val="center"/>
+      </w:pPr>
+      <w:r>
+        <w:drawing>
+          <wp:inline xmlns:a="http://schemas.openxmlformats.org/drawingml/2006/main" xmlns:pic="http://schemas.openxmlformats.org/drawingml/2006/picture">
+            <wp:extent cx="5916168" cy="2319038"/>
+            <wp:docPr id="28" name="Picture 28"/>
+            <wp:cNvGraphicFramePr>
+              <a:graphicFrameLocks noChangeAspect="1"/>
+            </wp:cNvGraphicFramePr>
+            <a:graphic>
+              <a:graphicData uri="http://schemas.openxmlformats.org/drawingml/2006/picture">
+                <pic:pic>
+                  <pic:nvPicPr>
+                    <pic:cNvPr id="0" name="diagram_mechanical_enclosure_thermal.png"/>
+                    <pic:cNvPicPr/>
+                  </pic:nvPicPr>
+                  <pic:blipFill>
+                    <a:blip r:embed="rId22"/>
+                    <a:stretch>
+                      <a:fillRect/>
+                    </a:stretch>
+                  </pic:blipFill>
+                  <pic:spPr>
+                    <a:xfrm>
+                      <a:off x="0" y="0"/>
+                      <a:ext cx="5916168" cy="2319038"/>
+                    </a:xfrm>
+                    <a:prstGeom prst="rect"/>
+                  </pic:spPr>
+                </pic:pic>
+              </a:graphicData>
+            </a:graphic>
+          </wp:inline>
+        </w:drawing>
+      </w:r>
+    </w:p>
     <w:p>
       <w:pPr>
         <w:pStyle w:val="Caption"/>
       </w:pPr>
       <w:r>
-        <w:t>Figure 7: System 1 Domain 2 (Mechanical) Enclosure &amp; Thermal Architecture</w:t>
+        <w:t>Figure 7: System 1 Domain 2 (Mechanical) Enclosure &amp; Thermal Architecture Block Diagram</w:t>
       </w:r>
     </w:p>
     <w:p>
@@ -22026,99 +21938,51 @@
       <w:bookmarkEnd w:id="116"/>
       <w:bookmarkEnd w:id="117"/>
     </w:p>
-    <w:tbl>
-      <w:tblPr>
-        <w:tblW w:type="dxa" w:w="9316"/>
-        <w:tblLayout w:type="fixed"/>
-        <w:tblLook w:firstColumn="1" w:firstRow="1" w:lastColumn="0" w:lastRow="0" w:noHBand="0" w:noVBand="1" w:val="04A0"/>
-        <w:tblBorders>
-          <w:top w:val="single" w:sz="6" w:space="0" w:color="A0AEC0"/>
-          <w:left w:val="single" w:sz="6" w:space="0" w:color="A0AEC0"/>
-          <w:bottom w:val="single" w:sz="6" w:space="0" w:color="A0AEC0"/>
-          <w:right w:val="single" w:sz="6" w:space="0" w:color="A0AEC0"/>
-          <w:insideH w:val="single" w:sz="6" w:space="0" w:color="A0AEC0"/>
-          <w:insideV w:val="single" w:sz="6" w:space="0" w:color="A0AEC0"/>
-        </w:tblBorders>
-      </w:tblPr>
-      <w:tblGrid>
-        <w:gridCol w:w="9316"/>
-      </w:tblGrid>
-      <w:tr>
-        <w:trPr>
-          <w:cantSplit/>
-          <w:tblHeader/>
-        </w:trPr>
-        <w:tc>
-          <w:tcPr>
-            <w:tcW w:type="dxa" w:w="9316"/>
-            <w:shd w:val="clear" w:color="auto" w:fill="F4F6F9"/>
-            <w:tcMar>
-              <w:top w:w="140" w:type="dxa"/>
-              <w:bottom w:w="140" w:type="dxa"/>
-              <w:left w:w="180" w:type="dxa"/>
-              <w:right w:w="180" w:type="dxa"/>
-            </w:tcMar>
-          </w:tcPr>
-          <w:p>
-            <w:pPr>
-              <w:spacing w:before="40" w:after="40" w:line="252" w:lineRule="auto"/>
-            </w:pPr>
-            <w:r>
-              <w:rPr>
-                <w:rFonts w:ascii="Consolas" w:hAnsi="Consolas"/>
-                <w:color w:val="141923"/>
-                <w:sz w:val="16"/>
-              </w:rPr>
-              <w:t>+--------------------------------------------------------------------------------------------------+</w:t>
-              <w:br/>
-              <w:t>| SYSTEM 2: DOMAIN 1 (EMBEDDED SOFTWARE) MULTITASKING FreeRTOS ARCHITECTURE                        |</w:t>
-              <w:br/>
-              <w:t>+--------------------------------------------------------------------------------------------------+</w:t>
-              <w:br/>
-              <w:t xml:space="preserve">  [FreeRTOS Kernel v10.4 - Preemptive Scheduling, 1ms SysTick]                                     </w:t>
-              <w:br/>
-              <w:t xml:space="preserve">                                                                                                   </w:t>
-              <w:br/>
-              <w:t xml:space="preserve">  • Task 1: Protection &amp; Fault Supervisory Task (Priority: Real-Time / Highest, Period: 1ms)       </w:t>
-              <w:br/>
-              <w:t xml:space="preserve">            Reads ADC OVP/OTP trip lines, services emergency shutdown, controls output gate FET.   </w:t>
-              <w:br/>
-              <w:t xml:space="preserve">                                                                                                   </w:t>
-              <w:br/>
-              <w:t xml:space="preserve">  • Task 2: Dual-Domain Power Telemetry Task (Priority: High, Period: 100ms / 10Hz)                </w:t>
-              <w:br/>
-              <w:t xml:space="preserve">            Reads AMC1311 AC power, INA226 DC rail, calculates true efficiency, pushes to queue.  </w:t>
-              <w:br/>
-              <w:t xml:space="preserve">                                                                                                   </w:t>
-              <w:br/>
-              <w:t xml:space="preserve">  • Task 3: SCPI Parser &amp; USB-CDC Task (Priority: Medium, Event-Driven)                            </w:t>
-              <w:br/>
-              <w:t xml:space="preserve">            Parses IEEE 488.2 commands (:VOLT, :CURR, :MEAS), formats SCPI response strings.      </w:t>
-              <w:br/>
-              <w:t xml:space="preserve">                                                                                                   </w:t>
-              <w:br/>
-              <w:t xml:space="preserve">  • Task 4: MicroSD FatFs Logging Task (Priority: Low, Period: 100ms)                              </w:t>
-              <w:br/>
-              <w:t xml:space="preserve">            Dequeues telemetry records, writes buffered CSV frames to FAT32 filesystem on SD card. </w:t>
-              <w:br/>
-              <w:t xml:space="preserve">                                                                                                   </w:t>
-              <w:br/>
-              <w:t xml:space="preserve">  • Task 5: OLED Graphical UI &amp; Encoder Task (Priority: Low, Period: 100ms / 10 fps)              </w:t>
-              <w:br/>
-              <w:t xml:space="preserve">            Renders graphical dashboard, power bar graph, services quadrature encoder clicks.      </w:t>
-              <w:br/>
-              <w:t>+--------------------------------------------------------------------------------------------------+</w:t>
-            </w:r>
-          </w:p>
-        </w:tc>
-      </w:tr>
-    </w:tbl>
+    <w:p>
+      <w:pPr>
+        <w:jc w:val="center"/>
+      </w:pPr>
+      <w:r>
+        <w:drawing>
+          <wp:inline xmlns:a="http://schemas.openxmlformats.org/drawingml/2006/main" xmlns:pic="http://schemas.openxmlformats.org/drawingml/2006/picture">
+            <wp:extent cx="5916168" cy="5757433"/>
+            <wp:docPr id="29" name="Picture 29"/>
+            <wp:cNvGraphicFramePr>
+              <a:graphicFrameLocks noChangeAspect="1"/>
+            </wp:cNvGraphicFramePr>
+            <a:graphic>
+              <a:graphicData uri="http://schemas.openxmlformats.org/drawingml/2006/picture">
+                <pic:pic>
+                  <pic:nvPicPr>
+                    <pic:cNvPr id="0" name="diagram_freertos_firmware_architecture.png"/>
+                    <pic:cNvPicPr/>
+                  </pic:nvPicPr>
+                  <pic:blipFill>
+                    <a:blip r:embed="rId23"/>
+                    <a:stretch>
+                      <a:fillRect/>
+                    </a:stretch>
+                  </pic:blipFill>
+                  <pic:spPr>
+                    <a:xfrm>
+                      <a:off x="0" y="0"/>
+                      <a:ext cx="5916168" cy="5757433"/>
+                    </a:xfrm>
+                    <a:prstGeom prst="rect"/>
+                  </pic:spPr>
+                </pic:pic>
+              </a:graphicData>
+            </a:graphic>
+          </wp:inline>
+        </w:drawing>
+      </w:r>
+    </w:p>
     <w:p>
       <w:pPr>
         <w:pStyle w:val="Caption"/>
       </w:pPr>
       <w:r>
-        <w:t>Figure 8: System 2 Domain 1 (Embedded Software) Multitasking FreeRTOS Architecture</w:t>
+        <w:t>Figure 8: System 2 Domain 1 (Embedded Software) Multitasking FreeRTOS Architecture Block Diagram</w:t>
       </w:r>
     </w:p>
     <w:p>

</xml_diff>

<commit_message>
docs(prd): align PRD scope and deliverables to Power Electronics Engineer Trainee role
</commit_message>
<xml_diff>
--- a/smart_programmable_power_supply/PRD.docx
+++ b/smart_programmable_power_supply/PRD.docx
@@ -633,7 +633,7 @@
                 <w:color w:val="000000"/>
                 <w:sz w:val="17"/>
               </w:rPr>
-              <w:t>08 Oct 2026</w:t>
+              <w:t>12 Oct 2026</w:t>
             </w:r>
           </w:p>
         </w:tc>
@@ -677,7 +677,7 @@
                 <w:color w:val="000000"/>
                 <w:sz w:val="17"/>
               </w:rPr>
-              <w:t>Initial release of PRD for Smart Programmable Voltage Supply Module</w:t>
+              <w:t>Initial release of PRD aligned with Power Electronics Engineer Trainee scope &amp; deliverables</w:t>
             </w:r>
           </w:p>
         </w:tc>
@@ -699,7 +699,7 @@
                 <w:color w:val="000000"/>
                 <w:sz w:val="17"/>
               </w:rPr>
-              <w:t>Hardware Team Lead</w:t>
+              <w:t>Power Electronics Engineer Trainee (GET - Hardware Engineering)</w:t>
             </w:r>
           </w:p>
         </w:tc>
@@ -836,7 +836,7 @@
                 <w:color w:val="000000"/>
                 <w:sz w:val="17"/>
               </w:rPr>
-              <w:t>Power HW Lead</w:t>
+              <w:t>Power Electronics Engineer Trainee (GET)</w:t>
             </w:r>
           </w:p>
         </w:tc>
@@ -858,7 +858,7 @@
                 <w:color w:val="000000"/>
                 <w:sz w:val="17"/>
               </w:rPr>
-              <w:t>Lead Architect</w:t>
+              <w:t>Senior Hardware Architect</w:t>
             </w:r>
           </w:p>
         </w:tc>
@@ -880,7 +880,7 @@
                 <w:color w:val="000000"/>
                 <w:sz w:val="17"/>
               </w:rPr>
-              <w:t>BU Head</w:t>
+              <w:t>BU SME (Power Electronics)</w:t>
             </w:r>
           </w:p>
         </w:tc>
@@ -6417,7 +6417,12 @@
     </w:p>
     <w:p>
       <w:r>
-        <w:t xml:space="preserve">This Product Requirement Document (PRD) defines all engineering, electrical, mechanical, safety, firmware, and telemetry requirements for the Smart Programmable Voltage Supply Module (85–265 V AC In, 5–20 V / 3 A DC Out). This document serves as the single source of technical truth across development, verification, certification, and production. this document and what it contains. The purpose of this document is to capture all the requirements of the product being developed and to serve as reference for the entire development of the product. </w:t>
+        <w:t>This Product Requirement Document (PRD) defines all engineering, electrical, mechanical, safety, firmware, and telemetry requirements for the Smart Programmable Voltage Supply Module (85–265 V AC In, 5–20 V / 3 A DC Out). Prepared within the scope of a Power Electronics Engineer Trainee (Graduate Engineer Trainee - GET, Hardware Engineering) under BU SME mentorship, this document serves as the authoritative technical baseline across design, verification, safety compliance, and prototype bring-up.</w:t>
+        <w:br/>
+        <w:br/>
+        <w:t>Trainee Project Scope &amp; Engineering Ownership:</w:t>
+        <w:br/>
+        <w:t xml:space="preserve">The project is explicitly bounded to develop industrial-grade power electronics hardware design mastery within the graduate trainee scope. The trainee directly owns the power conversion design: Stage 1 AC-DC Quasi-Resonant Flyback calculations (PQ26/20 transformer magnetics, 3kV RMS reinforced isolation, Furukawa TEX-E wire), Stage 2 Synchronous 4-Switch Buck-Boost post-regulator design (LM5176 inductor sizing, MOSFET selection, low-ESR ripple filtering), analog DAC voltage steering feedback calculations, autonomous hardware CC protection (&lt; 5µs response), Altium Designer multi-sheet schematics, 4-layer PCB layout execution (Kelvin sensing, high-voltage creepage slot &gt;= 6.4mm), master engineering BOM, bench bring-up cold checks with safe Variac ramp-up, and Design Verification Testing (DVT). Adjacent domains—embedded firmware (FreeRTOS, SCPI parser) and mechanical tooling (aluminum extrusion, ID)—are cross-functional supporting domains with which the trainee defines hardware interfaces, pin mappings, scaling equations, and mechanical keep-outs. this document and what it contains. The purpose of this document is to capture all the requirements of the product being developed and to serve as reference for the entire development of the product. </w:t>
       </w:r>
     </w:p>
     <w:p>
@@ -6478,7 +6483,7 @@
     </w:p>
     <w:p>
       <w:r>
-        <w:t>This document is intended for Client Engineering &amp; Management (scope sign-off), Hardware Architecture Teams (schematics, magnetics, safety), Embedded Software Teams (control loops, SCPI), PCB Layout &amp; Mechanical Teams (stackup, creepage slots), and Quality Assurance (EMC &amp; safety verification). that the document is intended for, such as developers, project managers, marketing staff, users, testers, and documentation writers. Describe what the rest of this PRD contains and how it is organized. Suggest a sequence for reading the document, beginning with the Introductions sections and proceeding through the sections that are most pertinent to each reader type.&gt;</w:t>
+        <w:t>This document is intended for Client Engineering &amp; Management (scope sign-off), Senior Hardware Mentors &amp; BU SMEs (design calculations, stress derating, and safety sign-off), the Power Electronics Engineer Trainee (author and hardware design owner), Embedded Software Teams (control loops and SCPI interfaces), Mechanical Teams (enclosure and thermal interfaces), and Quality Assurance (EMC &amp; safety verification). that the document is intended for, such as developers, project managers, marketing staff, users, testers, and documentation writers. Describe what the rest of this PRD contains and how it is organized. Suggest a sequence for reading the document, beginning with the Introductions sections and proceeding through the sections that are most pertinent to each reader type.&gt;</w:t>
       </w:r>
     </w:p>
     <w:p>
@@ -13484,7 +13489,7 @@
                 <w:color w:val="000000"/>
                 <w:sz w:val="19"/>
               </w:rPr>
-              <w:t>Hardware - HW</w:t>
+              <w:t>Hardware - HW (Trainee Ownership)</w:t>
             </w:r>
           </w:p>
         </w:tc>
@@ -13506,7 +13511,7 @@
                 <w:color w:val="000000"/>
                 <w:sz w:val="19"/>
               </w:rPr>
-              <w:t>Yes</w:t>
+              <w:t>Yes (Primary)</w:t>
             </w:r>
           </w:p>
         </w:tc>
@@ -13577,7 +13582,7 @@
                 <w:color w:val="000000"/>
                 <w:sz w:val="19"/>
               </w:rPr>
-              <w:t>Mechanical - ME</w:t>
+              <w:t>Mechanical - ME (Cross-Functional)</w:t>
             </w:r>
           </w:p>
         </w:tc>
@@ -13599,7 +13604,7 @@
                 <w:color w:val="000000"/>
                 <w:sz w:val="19"/>
               </w:rPr>
-              <w:t>Yes</w:t>
+              <w:t>Yes (Interface)</w:t>
             </w:r>
           </w:p>
         </w:tc>
@@ -13670,7 +13675,7 @@
                 <w:color w:val="000000"/>
                 <w:sz w:val="19"/>
               </w:rPr>
-              <w:t>Embedded Firmware - FW</w:t>
+              <w:t>Embedded Firmware - FW (Cross-Functional)</w:t>
             </w:r>
           </w:p>
         </w:tc>
@@ -13714,7 +13719,7 @@
                 <w:color w:val="000000"/>
                 <w:sz w:val="19"/>
               </w:rPr>
-              <w:t>Yes</w:t>
+              <w:t>Yes (Primary)</w:t>
             </w:r>
           </w:p>
         </w:tc>
@@ -13763,7 +13768,7 @@
                 <w:color w:val="000000"/>
                 <w:sz w:val="19"/>
               </w:rPr>
-              <w:t>Software / App - SW</w:t>
+              <w:t>Software / App - SW (Cross-Functional)</w:t>
             </w:r>
           </w:p>
         </w:tc>
@@ -13829,7 +13834,7 @@
                 <w:color w:val="000000"/>
                 <w:sz w:val="19"/>
               </w:rPr>
-              <w:t>Yes</w:t>
+              <w:t>Yes (Primary)</w:t>
             </w:r>
           </w:p>
         </w:tc>
@@ -13949,7 +13954,7 @@
                 <w:color w:val="000000"/>
                 <w:sz w:val="19"/>
               </w:rPr>
-              <w:t>Quality Assurance - QA</w:t>
+              <w:t>Quality Assurance - QA (Joint)</w:t>
             </w:r>
           </w:p>
         </w:tc>
@@ -13971,7 +13976,7 @@
                 <w:color w:val="000000"/>
                 <w:sz w:val="19"/>
               </w:rPr>
-              <w:t>Yes</w:t>
+              <w:t>Yes (Joint)</w:t>
             </w:r>
           </w:p>
         </w:tc>
@@ -13993,7 +13998,7 @@
                 <w:color w:val="000000"/>
                 <w:sz w:val="19"/>
               </w:rPr>
-              <w:t>Yes</w:t>
+              <w:t>Yes (Joint)</w:t>
             </w:r>
           </w:p>
         </w:tc>
@@ -14015,7 +14020,7 @@
                 <w:color w:val="000000"/>
                 <w:sz w:val="19"/>
               </w:rPr>
-              <w:t>Yes</w:t>
+              <w:t>Yes (Joint)</w:t>
             </w:r>
           </w:p>
         </w:tc>
@@ -14157,7 +14162,7 @@
                 <w:color w:val="000000"/>
                 <w:sz w:val="19"/>
               </w:rPr>
-              <w:t>Yes</w:t>
+              <w:t>Yes (Pre-comp)</w:t>
             </w:r>
           </w:p>
         </w:tc>
@@ -19934,7 +19939,7 @@
         </w:rPr>
       </w:pPr>
       <w:r>
-        <w:t>The development lifecycle encompasses standard engineering deliverables across Hardware (HW), Mechanical (ME), Embedded Software (FW), and Quality Assurance (QA). The phase-wise deliverables and formal release order are summarized in Table 10 below: for each system, shall be listed here. Some of the other common documents like PRD, user Manual etc shall also be captured.&gt;</w:t>
+        <w:t>The development lifecycle encompasses standard engineering deliverables across Hardware (HW), Mechanical (ME), Embedded Software (FW), and Quality Assurance (QA). As the primary hardware design owner, the Power Electronics Trainee directly owns Domain 1 deliverables (HDD, schematics, PCB layout, BOM, bring-up, and DVT reports), collaborating with cross-functional teams for firmware and mechanical releases. The phase-wise deliverables and formal release order are summarized in Table 10 below: for each system, shall be listed here. Some of the other common documents like PRD, user Manual etc shall also be captured.&gt;</w:t>
       </w:r>
     </w:p>
     <w:p>
@@ -20079,7 +20084,7 @@
                 <w:color w:val="000000"/>
                 <w:sz w:val="19"/>
               </w:rPr>
-              <w:t>Domain 1 [HW]</w:t>
+              <w:t>Domain 1 [HW - Trainee]</w:t>
             </w:r>
           </w:p>
         </w:tc>
@@ -20102,7 +20107,7 @@
                 <w:color w:val="000000"/>
                 <w:sz w:val="19"/>
               </w:rPr>
-              <w:t>Domain 2 [Mechanical]</w:t>
+              <w:t>Domain 2 [ME - Support]</w:t>
             </w:r>
           </w:p>
         </w:tc>
@@ -20125,7 +20130,7 @@
                 <w:color w:val="000000"/>
                 <w:sz w:val="19"/>
               </w:rPr>
-              <w:t>Domain 3 [Embedded SW]</w:t>
+              <w:t>Domain 3 [FW - Support]</w:t>
             </w:r>
           </w:p>
         </w:tc>
@@ -20148,7 +20153,7 @@
                 <w:color w:val="000000"/>
                 <w:sz w:val="19"/>
               </w:rPr>
-              <w:t>Domain 4 [QA &amp; Test]</w:t>
+              <w:t>Domain 4 [QA - Joint]</w:t>
             </w:r>
           </w:p>
         </w:tc>
@@ -27392,7 +27397,7 @@
         </w:numPr>
       </w:pPr>
       <w:r>
-        <w:t>Negative/bipolar voltage rails (system provides positive 5.0V to 20.0V DC only). Wireless connectivity (Wi-Fi/Bluetooth) is excluded.</w:t>
+        <w:t>Negative/bipolar voltage rails (system provides positive 5.0V to 20.0V DC only). Wireless connectivity (Wi-Fi/Bluetooth) is excluded. Trainee direct boundaries: firmware kernel implementation, custom aluminum extrusion die tooling, and accredited regulatory laboratory filing are executed by collaborating cross-functional teams.</w:t>
       </w:r>
     </w:p>
     <w:p>
@@ -27471,6 +27476,123 @@
           <w:lang w:val="en-IN" w:eastAsia="zh-CN" w:bidi="hi-IN"/>
         </w:rPr>
       </w:pPr>
+    </w:p>
+    <w:p>
+      <w:pPr>
+        <w:pStyle w:val="Heading1"/>
+      </w:pPr>
+      <w:r>
+        <w:t>Appendix: Power Electronics Engineer Trainee Mentor Walkthrough &amp; Q&amp;A Cheatsheet</w:t>
+      </w:r>
+    </w:p>
+    <w:p>
+      <w:r>
+        <w:t>This appendix provides key talking points and technical rationales for the Power Electronics Engineer Trainee (GET) when presenting design choices, circuit calculations, component selections, and safety boundaries to senior mentors and BU leadership:</w:t>
+      </w:r>
+    </w:p>
+    <w:p>
+      <w:pPr>
+        <w:pStyle w:val="Heading3"/>
+      </w:pPr>
+      <w:r>
+        <w:t>Q1: Why did you choose a 2-stage architecture instead of converting AC directly to 5–20V?</w:t>
+      </w:r>
+    </w:p>
+    <w:p>
+      <w:r>
+        <w:t>Direct single-stage AC-to-DC conversion across a wide 5V to 20V output range is inefficient and difficult to stabilize because transformer turns ratios and duty cycles would have to vary wildly. By splitting the design into Stage 1 (an isolated Flyback that produces a fixed +24V intermediate rail) and Stage 2 (a non-isolated 4-switch Buck-Boost post-regulator), Stage 1 handles safety isolation and high-voltage rectification, while Stage 2 provides fast, tight voltage tuning with sub-25mV ripple and over 95% efficiency.</w:t>
+      </w:r>
+    </w:p>
+    <w:p>
+      <w:pPr>
+        <w:pStyle w:val="Heading3"/>
+      </w:pPr>
+      <w:r>
+        <w:t>Q2: How is galvanic safety isolation achieved, and what standard applies?</w:t>
+      </w:r>
+    </w:p>
+    <w:p>
+      <w:r>
+        <w:t>We comply strictly with IEC 62368-1 for reinforced safety isolation. We use a custom transformer wound with triple-insulated Furukawa TEX-E wire, optocouplers for feedback, and an AMC1311 isolated modulator for AC voltage sensing. The PCB includes a 6.4mm physical milled air slot to maintain safety creepage distance between the hot primary side and the cold secondary side. It withstands a 3000V RMS Hipot dielectric test for 1 minute.</w:t>
+      </w:r>
+    </w:p>
+    <w:p>
+      <w:pPr>
+        <w:pStyle w:val="Heading3"/>
+      </w:pPr>
+      <w:r>
+        <w:t>Q3: How does the microcontroller set the output voltage?</w:t>
+      </w:r>
+    </w:p>
+    <w:p>
+      <w:r>
+        <w:t>We use DAC voltage steering. The LM5176 Buck-Boost controller regulates based on its feedback (FB) pin. The STM32's internal 12-bit DAC injects a small, controlled current into the feedback resistor network (R_top = 49.9kΩ, R_DAC = 11.0kΩ, R_bot = 3.65kΩ). As the DAC voltage changes, it tricks the controller into raising or lowering the output voltage between 5.0V and 20.0V in precise 10mV increments.</w:t>
+      </w:r>
+    </w:p>
+    <w:p>
+      <w:pPr>
+        <w:pStyle w:val="Heading3"/>
+      </w:pPr>
+      <w:r>
+        <w:t>Q4: How does the power supply protect itself during a short circuit?</w:t>
+      </w:r>
+    </w:p>
+    <w:p>
+      <w:r>
+        <w:t>We have two layers of protection. First and most importantly, we have a fast analog hardware loop: an INA240 current sense amplifier feeds a high-speed TLV3501 analog comparator. If output current exceeds the set limit, the comparator directly pulls down the LM5176's COMP pin in under 5 microseconds, instantly throttling the duty cycle. The second layer is a software task in the STM32 that detects the persistent overload, updates the OLED to show 'CC FAULT', and disconnects the output if the fault persists.</w:t>
+      </w:r>
+    </w:p>
+    <w:p>
+      <w:pPr>
+        <w:pStyle w:val="Heading3"/>
+      </w:pPr>
+      <w:r>
+        <w:t>Q5: How is electrical efficiency calculated in real time?</w:t>
+      </w:r>
+    </w:p>
+    <w:p>
+      <w:r>
+        <w:t>We have dual-domain power metering. On the primary AC side, an isolated AMC1311 modulator measures RMS voltage, and a 1000:1 current transformer measures RMS current to compute true active AC input power (P_AC). On the secondary DC side, a high-precision 16-bit INA226 monitor measures DC output voltage and current to compute output power (P_DC). At a 10Hz rate, the MCU calculates Efficiency = (P_DC / P_AC) * 100% and displays it live on the OLED and logs it to the MicroSD card.</w:t>
+      </w:r>
+    </w:p>
+    <w:p>
+      <w:pPr>
+        <w:pStyle w:val="Heading3"/>
+      </w:pPr>
+      <w:r>
+        <w:t>Q6: What are the main deliverables you are responsible for as a Power Electronics Trainee?</w:t>
+      </w:r>
+    </w:p>
+    <w:p>
+      <w:r>
+        <w:t>Following VVDN's standard development plan across 4 phases and 10 release milestones, my primary hardware deliverables are: the Hardware Design Document (HDD), Flyback and Buck-Boost calculations, PQ26/20 transformer design, Altium schematics, 4-layer PCB layout with safety creepage slots, master engineering BOM, prototype bring-up cold checks and Variac testing, dynamic load transient test reports, CISPR 32 EMC and Hipot safety pre-compliance reports, and final Rev B production documentation.</w:t>
+      </w:r>
+    </w:p>
+    <w:p>
+      <w:pPr>
+        <w:pStyle w:val="Heading3"/>
+      </w:pPr>
+      <w:r>
+        <w:t>Q7: How do you interface with the firmware and mechanical teams?</w:t>
+      </w:r>
+    </w:p>
+    <w:p>
+      <w:r>
+        <w:t>For the firmware team, I define hardware register mappings, DAC scaling formulas (target voltage to DAC code), INA226/AMC1311 gain constants, and comparator fault trip lines. For the mechanical team, I specify the 3D STEP PCBA model, connector keep-outs, thermal loss figures (7.5W max at 60W load), and thermal gap pad placement locations.</w:t>
+      </w:r>
+    </w:p>
+    <w:p>
+      <w:pPr>
+        <w:pStyle w:val="Heading3"/>
+      </w:pPr>
+      <w:r>
+        <w:t>Q8: How did you calculate the transformer magnetics and verify safety creepage?</w:t>
+      </w:r>
+    </w:p>
+    <w:p>
+      <w:r>
+        <w:t>For the Flyback transformer, I selected a Ferroxcube PQ26/20 ferrite core with 3C95 material. At 85V AC minimum input (120V DC bulk) and 72W output power, I calculated a primary inductance Lp of 220µH to operate in quasi-resonant valley switching with a 6:1 turns ratio. To comply with IEC 62368-1 reinforced isolation (3000V RMS), I specified triple-insulated Furukawa TEX-E wire on the secondary winding. On the PCB layout, I routed a 6.4mm wide milled air slot beneath the transformer and optocoupler barriers to prevent surface tracking.</w:t>
+      </w:r>
     </w:p>
     <w:sectPr>
       <w:headerReference w:type="default" r:id="rId13"/>

</xml_diff>